<commit_message>
sp2 methods, chapter 4
</commit_message>
<xml_diff>
--- a/32SS Systemy shtuchnogo/2/KNT-122_Onyshchenko_Variant-19_PR2.docx
+++ b/32SS Systemy shtuchnogo/2/KNT-122_Onyshchenko_Variant-19_PR2.docx
@@ -960,7 +960,6 @@
       </w:pPr>
       <w:r>
         <w:rPr>
-          <w:rFonts w:ascii="Courier New" w:hAnsi="Courier New"/>
           <w:color w:val="auto"/>
         </w:rPr>
         <w:t>from matplotlib import pyplot as plt</w:t>
@@ -976,7 +975,6 @@
       </w:pPr>
       <w:r>
         <w:rPr>
-          <w:rFonts w:ascii="Courier New" w:hAnsi="Courier New"/>
           <w:color w:val="auto"/>
         </w:rPr>
         <w:t>from sklearn.datasets import load_iris</w:t>
@@ -992,7 +990,6 @@
       </w:pPr>
       <w:r>
         <w:rPr>
-          <w:rFonts w:ascii="Courier New" w:hAnsi="Courier New"/>
           <w:color w:val="auto"/>
         </w:rPr>
       </w:r>
@@ -1007,7 +1004,6 @@
       </w:pPr>
       <w:r>
         <w:rPr>
-          <w:rFonts w:ascii="Courier New" w:hAnsi="Courier New"/>
           <w:color w:val="auto"/>
         </w:rPr>
         <w:t>iris=load_iris()</w:t>
@@ -1023,7 +1019,6 @@
       </w:pPr>
       <w:r>
         <w:rPr>
-          <w:rFonts w:ascii="Courier New" w:hAnsi="Courier New"/>
           <w:color w:val="auto"/>
         </w:rPr>
         <w:t>X=iris['data']</w:t>
@@ -1039,7 +1034,6 @@
       </w:pPr>
       <w:r>
         <w:rPr>
-          <w:rFonts w:ascii="Courier New" w:hAnsi="Courier New"/>
           <w:color w:val="auto"/>
         </w:rPr>
         <w:t>pairs=[(i,j) for i in range(len(iris['feature_names'])) for j in range(i+1,len(iris['feature_names']))]</w:t>
@@ -1055,7 +1049,6 @@
       </w:pPr>
       <w:r>
         <w:rPr>
-          <w:rFonts w:ascii="Courier New" w:hAnsi="Courier New"/>
           <w:color w:val="auto"/>
         </w:rPr>
       </w:r>
@@ -1070,7 +1063,6 @@
       </w:pPr>
       <w:r>
         <w:rPr>
-          <w:rFonts w:ascii="Courier New" w:hAnsi="Courier New"/>
           <w:color w:val="auto"/>
         </w:rPr>
         <w:t>for i,(f1,f2) in enumerate(pairs):</w:t>
@@ -1086,14 +1078,12 @@
       </w:pPr>
       <w:r>
         <w:rPr>
-          <w:rFonts w:ascii="Courier New" w:hAnsi="Courier New"/>
           <w:color w:val="auto"/>
         </w:rPr>
         <w:t xml:space="preserve">    </w:t>
       </w:r>
       <w:r>
         <w:rPr>
-          <w:rFonts w:ascii="Courier New" w:hAnsi="Courier New"/>
           <w:b w:val="false"/>
           <w:color w:val="auto"/>
           <w:sz w:val="21"/>
@@ -1111,14 +1101,12 @@
       </w:pPr>
       <w:r>
         <w:rPr>
-          <w:rFonts w:ascii="Courier New" w:hAnsi="Courier New"/>
           <w:color w:val="auto"/>
         </w:rPr>
         <w:t xml:space="preserve">    </w:t>
       </w:r>
       <w:r>
         <w:rPr>
-          <w:rFonts w:ascii="Courier New" w:hAnsi="Courier New"/>
           <w:b w:val="false"/>
           <w:color w:val="auto"/>
           <w:sz w:val="21"/>
@@ -1136,14 +1124,12 @@
       </w:pPr>
       <w:r>
         <w:rPr>
-          <w:rFonts w:ascii="Courier New" w:hAnsi="Courier New"/>
           <w:color w:val="auto"/>
         </w:rPr>
         <w:t xml:space="preserve">    </w:t>
       </w:r>
       <w:r>
         <w:rPr>
-          <w:rFonts w:ascii="Courier New" w:hAnsi="Courier New"/>
           <w:b w:val="false"/>
           <w:color w:val="auto"/>
           <w:sz w:val="21"/>
@@ -1161,14 +1147,12 @@
       </w:pPr>
       <w:r>
         <w:rPr>
-          <w:rFonts w:ascii="Courier New" w:hAnsi="Courier New"/>
           <w:color w:val="auto"/>
         </w:rPr>
         <w:t xml:space="preserve">    </w:t>
       </w:r>
       <w:r>
         <w:rPr>
-          <w:rFonts w:ascii="Courier New" w:hAnsi="Courier New"/>
           <w:b w:val="false"/>
           <w:color w:val="auto"/>
           <w:sz w:val="21"/>
@@ -1186,14 +1170,12 @@
       </w:pPr>
       <w:r>
         <w:rPr>
-          <w:rFonts w:ascii="Courier New" w:hAnsi="Courier New"/>
           <w:color w:val="auto"/>
         </w:rPr>
         <w:t xml:space="preserve">    </w:t>
       </w:r>
       <w:r>
         <w:rPr>
-          <w:rFonts w:ascii="Courier New" w:hAnsi="Courier New"/>
           <w:b w:val="false"/>
           <w:color w:val="auto"/>
           <w:sz w:val="21"/>
@@ -1211,7 +1193,6 @@
       </w:pPr>
       <w:r>
         <w:rPr>
-          <w:rFonts w:ascii="Courier New" w:hAnsi="Courier New"/>
           <w:color w:val="000000"/>
           <w:shd w:fill="FFFFFF" w:val="clear"/>
         </w:rPr>
@@ -1219,7 +1200,6 @@
       </w:r>
       <w:r>
         <w:rPr>
-          <w:rFonts w:ascii="Courier New" w:hAnsi="Courier New"/>
           <w:b w:val="false"/>
           <w:color w:val="000000"/>
           <w:sz w:val="21"/>
@@ -1796,6 +1776,926 @@
           <w:color w:val="auto"/>
           <w:lang w:val="uk-UA"/>
         </w:rPr>
+        <w:t>Робота методу К-середніх:</w:t>
+      </w:r>
+    </w:p>
+    <w:p>
+      <w:pPr>
+        <w:pStyle w:val="P1"/>
+        <w:widowControl/>
+        <w:numPr>
+          <w:ilvl w:val="0"/>
+          <w:numId w:val="1"/>
+        </w:numPr>
+        <w:suppressAutoHyphens w:val="true"/>
+        <w:bidi w:val="0"/>
+        <w:spacing w:lineRule="auto" w:line="360" w:before="0" w:after="0"/>
+        <w:ind w:hanging="340" w:left="850" w:right="0"/>
+        <w:jc w:val="both"/>
+        <w:rPr>
+          <w:color w:val="auto"/>
+          <w:lang w:val="uk-UA"/>
+        </w:rPr>
+      </w:pPr>
+      <w:r>
+        <w:rPr>
+          <w:color w:val="auto"/>
+          <w:lang w:val="uk-UA"/>
+        </w:rPr>
+        <w:t>Визначити кількість кластерів (значення К);</w:t>
+      </w:r>
+    </w:p>
+    <w:p>
+      <w:pPr>
+        <w:pStyle w:val="P1"/>
+        <w:widowControl/>
+        <w:numPr>
+          <w:ilvl w:val="0"/>
+          <w:numId w:val="1"/>
+        </w:numPr>
+        <w:suppressAutoHyphens w:val="true"/>
+        <w:bidi w:val="0"/>
+        <w:spacing w:lineRule="auto" w:line="360" w:before="0" w:after="0"/>
+        <w:ind w:hanging="340" w:left="850" w:right="0"/>
+        <w:jc w:val="both"/>
+        <w:rPr>
+          <w:color w:val="auto"/>
+          <w:lang w:val="uk-UA"/>
+        </w:rPr>
+      </w:pPr>
+      <w:r>
+        <w:rPr>
+          <w:color w:val="auto"/>
+          <w:lang w:val="uk-UA"/>
+        </w:rPr>
+        <w:t>Створити К центроїдів «випадковим» чином;</w:t>
+      </w:r>
+    </w:p>
+    <w:p>
+      <w:pPr>
+        <w:pStyle w:val="P1"/>
+        <w:widowControl/>
+        <w:numPr>
+          <w:ilvl w:val="0"/>
+          <w:numId w:val="1"/>
+        </w:numPr>
+        <w:suppressAutoHyphens w:val="true"/>
+        <w:bidi w:val="0"/>
+        <w:spacing w:lineRule="auto" w:line="360" w:before="0" w:after="0"/>
+        <w:ind w:hanging="340" w:left="850" w:right="0"/>
+        <w:jc w:val="both"/>
+        <w:rPr>
+          <w:color w:val="auto"/>
+          <w:lang w:val="uk-UA"/>
+        </w:rPr>
+      </w:pPr>
+      <w:r>
+        <w:rPr>
+          <w:color w:val="auto"/>
+          <w:lang w:val="uk-UA"/>
+        </w:rPr>
+        <w:t>Призначити кожен екземпляр до якогось центроїду в залежності від їх відстаней;</w:t>
+      </w:r>
+    </w:p>
+    <w:p>
+      <w:pPr>
+        <w:pStyle w:val="P1"/>
+        <w:widowControl/>
+        <w:numPr>
+          <w:ilvl w:val="0"/>
+          <w:numId w:val="1"/>
+        </w:numPr>
+        <w:suppressAutoHyphens w:val="true"/>
+        <w:bidi w:val="0"/>
+        <w:spacing w:lineRule="auto" w:line="360" w:before="0" w:after="0"/>
+        <w:ind w:hanging="340" w:left="850" w:right="0"/>
+        <w:jc w:val="both"/>
+        <w:rPr>
+          <w:color w:val="auto"/>
+          <w:lang w:val="uk-UA"/>
+        </w:rPr>
+      </w:pPr>
+      <w:r>
+        <w:rPr>
+          <w:color w:val="auto"/>
+          <w:lang w:val="uk-UA"/>
+        </w:rPr>
+        <w:t>Оновити центроїди як середня відстань між усіма елементами кластера;</w:t>
+      </w:r>
+    </w:p>
+    <w:p>
+      <w:pPr>
+        <w:pStyle w:val="P1"/>
+        <w:widowControl/>
+        <w:numPr>
+          <w:ilvl w:val="0"/>
+          <w:numId w:val="1"/>
+        </w:numPr>
+        <w:suppressAutoHyphens w:val="true"/>
+        <w:bidi w:val="0"/>
+        <w:spacing w:lineRule="auto" w:line="360" w:before="0" w:after="0"/>
+        <w:ind w:hanging="340" w:left="850" w:right="0"/>
+        <w:jc w:val="both"/>
+        <w:rPr>
+          <w:color w:val="auto"/>
+          <w:lang w:val="uk-UA"/>
+        </w:rPr>
+      </w:pPr>
+      <w:r>
+        <w:rPr>
+          <w:color w:val="auto"/>
+          <w:lang w:val="uk-UA"/>
+        </w:rPr>
+        <w:t>Повторювати доки центроїд не буде суттєво змінюватися.</w:t>
+      </w:r>
+    </w:p>
+    <w:p>
+      <w:pPr>
+        <w:pStyle w:val="P1"/>
+        <w:widowControl/>
+        <w:suppressAutoHyphens w:val="true"/>
+        <w:bidi w:val="0"/>
+        <w:spacing w:lineRule="auto" w:line="360" w:before="0" w:after="0"/>
+        <w:ind w:hanging="340" w:left="850" w:right="0"/>
+        <w:jc w:val="both"/>
+        <w:rPr>
+          <w:color w:val="auto"/>
+          <w:lang w:val="uk-UA"/>
+        </w:rPr>
+      </w:pPr>
+      <w:r>
+        <w:rPr>
+          <w:color w:val="auto"/>
+          <w:lang w:val="uk-UA"/>
+        </w:rPr>
+      </w:r>
+    </w:p>
+    <w:p>
+      <w:pPr>
+        <w:pStyle w:val="P1"/>
+        <w:widowControl/>
+        <w:suppressAutoHyphens w:val="true"/>
+        <w:bidi w:val="0"/>
+        <w:spacing w:lineRule="auto" w:line="360" w:before="0" w:after="0"/>
+        <w:ind w:hanging="340" w:left="850" w:right="0"/>
+        <w:jc w:val="both"/>
+        <w:rPr>
+          <w:color w:val="auto"/>
+          <w:lang w:val="uk-UA"/>
+        </w:rPr>
+      </w:pPr>
+      <w:r>
+        <w:rPr>
+          <w:color w:val="auto"/>
+          <w:lang w:val="uk-UA"/>
+        </w:rPr>
+        <w:t>Робота методу ієрархічної кластеризації (агломеративної):</w:t>
+      </w:r>
+    </w:p>
+    <w:p>
+      <w:pPr>
+        <w:pStyle w:val="P1"/>
+        <w:widowControl/>
+        <w:numPr>
+          <w:ilvl w:val="0"/>
+          <w:numId w:val="2"/>
+        </w:numPr>
+        <w:suppressAutoHyphens w:val="true"/>
+        <w:bidi w:val="0"/>
+        <w:spacing w:lineRule="auto" w:line="360" w:before="0" w:after="0"/>
+        <w:ind w:hanging="340" w:left="850" w:right="0"/>
+        <w:jc w:val="both"/>
+        <w:rPr>
+          <w:color w:val="auto"/>
+          <w:lang w:val="uk-UA"/>
+        </w:rPr>
+      </w:pPr>
+      <w:r>
+        <w:rPr>
+          <w:color w:val="auto"/>
+          <w:lang w:val="uk-UA"/>
+        </w:rPr>
+        <w:t>Кожен елемент це свій кластер. Визначити два кластери, які найбільш схожі між собою. Об’єднати їх;</w:t>
+      </w:r>
+    </w:p>
+    <w:p>
+      <w:pPr>
+        <w:pStyle w:val="P1"/>
+        <w:widowControl/>
+        <w:numPr>
+          <w:ilvl w:val="0"/>
+          <w:numId w:val="2"/>
+        </w:numPr>
+        <w:suppressAutoHyphens w:val="true"/>
+        <w:bidi w:val="0"/>
+        <w:spacing w:lineRule="auto" w:line="360" w:before="0" w:after="0"/>
+        <w:ind w:hanging="340" w:left="850" w:right="0"/>
+        <w:jc w:val="both"/>
+        <w:rPr>
+          <w:color w:val="auto"/>
+          <w:lang w:val="uk-UA"/>
+        </w:rPr>
+      </w:pPr>
+      <w:r>
+        <w:rPr>
+          <w:color w:val="auto"/>
+          <w:lang w:val="uk-UA"/>
+        </w:rPr>
+        <w:t>Знову обрахувати відстані і повторювати об’єднання доки не буде задоволений критерій кінця (наприклад, задана кількість кластерів).</w:t>
+      </w:r>
+    </w:p>
+    <w:p>
+      <w:pPr>
+        <w:pStyle w:val="P1"/>
+        <w:rPr>
+          <w:color w:val="auto"/>
+          <w:lang w:val="uk-UA"/>
+        </w:rPr>
+      </w:pPr>
+      <w:r>
+        <w:rPr>
+          <w:color w:val="auto"/>
+          <w:lang w:val="uk-UA"/>
+        </w:rPr>
+      </w:r>
+    </w:p>
+    <w:p>
+      <w:pPr>
+        <w:pStyle w:val="P1"/>
+        <w:rPr>
+          <w:color w:val="auto"/>
+          <w:lang w:val="en-US"/>
+        </w:rPr>
+      </w:pPr>
+      <w:r>
+        <w:rPr>
+          <w:color w:val="auto"/>
+          <w:lang w:val="uk-UA"/>
+        </w:rPr>
+        <w:t xml:space="preserve">Для реалізації були використані класи </w:t>
+      </w:r>
+      <w:r>
+        <w:rPr>
+          <w:color w:val="auto"/>
+          <w:lang w:val="en-US"/>
+        </w:rPr>
+        <w:t xml:space="preserve">KMeans </w:t>
+      </w:r>
+      <w:r>
+        <w:rPr>
+          <w:color w:val="auto"/>
+          <w:lang w:val="uk-UA"/>
+        </w:rPr>
+        <w:t xml:space="preserve">та </w:t>
+      </w:r>
+      <w:r>
+        <w:rPr>
+          <w:color w:val="auto"/>
+          <w:lang w:val="en-US"/>
+        </w:rPr>
+        <w:t xml:space="preserve">AgglomerativeClustering </w:t>
+      </w:r>
+      <w:r>
+        <w:rPr>
+          <w:color w:val="auto"/>
+          <w:lang w:val="uk-UA"/>
+        </w:rPr>
+        <w:t xml:space="preserve">з пакету </w:t>
+      </w:r>
+      <w:r>
+        <w:rPr>
+          <w:color w:val="auto"/>
+          <w:lang w:val="en-US"/>
+        </w:rPr>
+        <w:t>sklearn.cluster.</w:t>
+      </w:r>
+    </w:p>
+    <w:p>
+      <w:pPr>
+        <w:pStyle w:val="P1"/>
+        <w:rPr>
+          <w:color w:val="auto"/>
+          <w:lang w:val="uk-UA"/>
+        </w:rPr>
+      </w:pPr>
+      <w:r>
+        <w:rPr>
+          <w:color w:val="auto"/>
+          <w:lang w:val="uk-UA"/>
+        </w:rPr>
+        <w:t>Якщо задати кількість кластерів 2, результати мають меншу помилку. Якщо кількість кластерів 3, помилка більша.</w:t>
+      </w:r>
+    </w:p>
+    <w:p>
+      <w:pPr>
+        <w:pStyle w:val="P1"/>
+        <w:rPr>
+          <w:color w:val="auto"/>
+          <w:lang w:val="uk-UA"/>
+        </w:rPr>
+      </w:pPr>
+      <w:r>
+        <w:rPr>
+          <w:color w:val="auto"/>
+          <w:lang w:val="uk-UA"/>
+        </w:rPr>
+      </w:r>
+    </w:p>
+    <w:p>
+      <w:pPr>
+        <w:pStyle w:val="P1"/>
+        <w:rPr>
+          <w:color w:val="auto"/>
+          <w:lang w:val="uk-UA"/>
+        </w:rPr>
+      </w:pPr>
+      <w:r>
+        <w:rPr>
+          <w:color w:val="auto"/>
+          <w:lang w:val="uk-UA"/>
+        </w:rPr>
+        <w:t xml:space="preserve">Код </w:t>
+      </w:r>
+    </w:p>
+    <w:p>
+      <w:pPr>
+        <w:pStyle w:val="P1"/>
+        <w:rPr>
+          <w:color w:val="auto"/>
+          <w:lang w:val="uk-UA"/>
+        </w:rPr>
+      </w:pPr>
+      <w:r>
+        <w:rPr>
+          <w:color w:val="auto"/>
+          <w:lang w:val="uk-UA"/>
+        </w:rPr>
+      </w:r>
+    </w:p>
+    <w:p>
+      <w:pPr>
+        <w:pStyle w:val="Code"/>
+        <w:rPr>
+          <w:rFonts w:ascii="Courier New" w:hAnsi="Courier New"/>
+          <w:color w:val="auto"/>
+        </w:rPr>
+      </w:pPr>
+      <w:r>
+        <w:rPr>
+          <w:rFonts w:ascii="Courier New" w:hAnsi="Courier New"/>
+          <w:color w:val="auto"/>
+        </w:rPr>
+        <w:t>from sklearn.cluster import AgglomerativeClustering, KMeans</w:t>
+      </w:r>
+    </w:p>
+    <w:p>
+      <w:pPr>
+        <w:pStyle w:val="Code"/>
+        <w:rPr>
+          <w:rFonts w:ascii="Courier New" w:hAnsi="Courier New"/>
+          <w:color w:val="auto"/>
+        </w:rPr>
+      </w:pPr>
+      <w:r>
+        <w:rPr>
+          <w:rFonts w:ascii="Courier New" w:hAnsi="Courier New"/>
+          <w:color w:val="auto"/>
+        </w:rPr>
+        <w:t>from sklearn.datasets import load_iris</w:t>
+      </w:r>
+    </w:p>
+    <w:p>
+      <w:pPr>
+        <w:pStyle w:val="Code"/>
+        <w:rPr>
+          <w:rFonts w:ascii="Courier New" w:hAnsi="Courier New"/>
+          <w:color w:val="auto"/>
+        </w:rPr>
+      </w:pPr>
+      <w:r>
+        <w:rPr>
+          <w:rFonts w:ascii="Courier New" w:hAnsi="Courier New"/>
+          <w:color w:val="auto"/>
+        </w:rPr>
+        <w:t>from sklearn.model_selection import train_test_split</w:t>
+      </w:r>
+    </w:p>
+    <w:p>
+      <w:pPr>
+        <w:pStyle w:val="Code"/>
+        <w:rPr>
+          <w:rFonts w:ascii="Courier New" w:hAnsi="Courier New"/>
+          <w:color w:val="auto"/>
+        </w:rPr>
+      </w:pPr>
+      <w:r>
+        <w:rPr>
+          <w:rFonts w:ascii="Courier New" w:hAnsi="Courier New"/>
+          <w:color w:val="auto"/>
+        </w:rPr>
+      </w:r>
+    </w:p>
+    <w:p>
+      <w:pPr>
+        <w:pStyle w:val="Code"/>
+        <w:rPr>
+          <w:rFonts w:ascii="Courier New" w:hAnsi="Courier New"/>
+          <w:color w:val="auto"/>
+        </w:rPr>
+      </w:pPr>
+      <w:r>
+        <w:rPr>
+          <w:rFonts w:ascii="Courier New" w:hAnsi="Courier New"/>
+          <w:color w:val="auto"/>
+        </w:rPr>
+        <w:t>iris=load_iris()</w:t>
+      </w:r>
+    </w:p>
+    <w:p>
+      <w:pPr>
+        <w:pStyle w:val="Code"/>
+        <w:rPr>
+          <w:rFonts w:ascii="Courier New" w:hAnsi="Courier New"/>
+          <w:color w:val="auto"/>
+        </w:rPr>
+      </w:pPr>
+      <w:r>
+        <w:rPr>
+          <w:rFonts w:ascii="Courier New" w:hAnsi="Courier New"/>
+          <w:color w:val="auto"/>
+        </w:rPr>
+        <w:t>X=iris.data</w:t>
+      </w:r>
+    </w:p>
+    <w:p>
+      <w:pPr>
+        <w:pStyle w:val="Code"/>
+        <w:rPr>
+          <w:rFonts w:ascii="Courier New" w:hAnsi="Courier New"/>
+          <w:color w:val="auto"/>
+        </w:rPr>
+      </w:pPr>
+      <w:r>
+        <w:rPr>
+          <w:rFonts w:ascii="Courier New" w:hAnsi="Courier New"/>
+          <w:color w:val="auto"/>
+        </w:rPr>
+        <w:t>y=iris.target</w:t>
+      </w:r>
+    </w:p>
+    <w:p>
+      <w:pPr>
+        <w:pStyle w:val="Code"/>
+        <w:rPr>
+          <w:rFonts w:ascii="Courier New" w:hAnsi="Courier New"/>
+          <w:color w:val="auto"/>
+        </w:rPr>
+      </w:pPr>
+      <w:r>
+        <w:rPr>
+          <w:rFonts w:ascii="Courier New" w:hAnsi="Courier New"/>
+          <w:color w:val="auto"/>
+        </w:rPr>
+        <w:t># Розбиття вибірки на тестову та тренувальну</w:t>
+      </w:r>
+    </w:p>
+    <w:p>
+      <w:pPr>
+        <w:pStyle w:val="Code"/>
+        <w:rPr>
+          <w:rFonts w:ascii="Courier New" w:hAnsi="Courier New"/>
+          <w:color w:val="auto"/>
+        </w:rPr>
+      </w:pPr>
+      <w:r>
+        <w:rPr>
+          <w:rFonts w:ascii="Courier New" w:hAnsi="Courier New"/>
+          <w:color w:val="auto"/>
+        </w:rPr>
+        <w:t>X_train,X_test,y_train,y_test=train_test_split(X,y)</w:t>
+      </w:r>
+    </w:p>
+    <w:p>
+      <w:pPr>
+        <w:pStyle w:val="Code"/>
+        <w:rPr>
+          <w:rFonts w:ascii="Courier New" w:hAnsi="Courier New"/>
+          <w:color w:val="auto"/>
+        </w:rPr>
+      </w:pPr>
+      <w:r>
+        <w:rPr>
+          <w:rFonts w:ascii="Courier New" w:hAnsi="Courier New"/>
+          <w:color w:val="auto"/>
+        </w:rPr>
+      </w:r>
+    </w:p>
+    <w:p>
+      <w:pPr>
+        <w:pStyle w:val="Code"/>
+        <w:rPr>
+          <w:rFonts w:ascii="Courier New" w:hAnsi="Courier New"/>
+          <w:color w:val="auto"/>
+        </w:rPr>
+      </w:pPr>
+      <w:r>
+        <w:rPr>
+          <w:rFonts w:ascii="Courier New" w:hAnsi="Courier New"/>
+          <w:color w:val="auto"/>
+        </w:rPr>
+        <w:t>kmeans=KMeans(n_clusters=2)</w:t>
+      </w:r>
+    </w:p>
+    <w:p>
+      <w:pPr>
+        <w:pStyle w:val="Code"/>
+        <w:rPr>
+          <w:rFonts w:ascii="Courier New" w:hAnsi="Courier New"/>
+          <w:color w:val="auto"/>
+        </w:rPr>
+      </w:pPr>
+      <w:r>
+        <w:rPr>
+          <w:rFonts w:ascii="Courier New" w:hAnsi="Courier New"/>
+          <w:color w:val="auto"/>
+        </w:rPr>
+        <w:t>kmeans_results=kmeans.fit_predict(X_test)</w:t>
+      </w:r>
+    </w:p>
+    <w:p>
+      <w:pPr>
+        <w:pStyle w:val="Code"/>
+        <w:rPr>
+          <w:rFonts w:ascii="Courier New" w:hAnsi="Courier New"/>
+          <w:color w:val="auto"/>
+        </w:rPr>
+      </w:pPr>
+      <w:r>
+        <w:rPr>
+          <w:rFonts w:ascii="Courier New" w:hAnsi="Courier New"/>
+          <w:color w:val="auto"/>
+        </w:rPr>
+        <w:t># Оцінка похибки методу</w:t>
+      </w:r>
+    </w:p>
+    <w:p>
+      <w:pPr>
+        <w:pStyle w:val="Code"/>
+        <w:rPr>
+          <w:rFonts w:ascii="Courier New" w:hAnsi="Courier New"/>
+          <w:color w:val="auto"/>
+        </w:rPr>
+      </w:pPr>
+      <w:r>
+        <w:rPr>
+          <w:rFonts w:ascii="Courier New" w:hAnsi="Courier New"/>
+          <w:color w:val="auto"/>
+        </w:rPr>
+        <w:t>kmeans_score=kmeans.score(X_test)/len(X_test)</w:t>
+      </w:r>
+    </w:p>
+    <w:p>
+      <w:pPr>
+        <w:pStyle w:val="Code"/>
+        <w:rPr>
+          <w:rFonts w:ascii="Courier New" w:hAnsi="Courier New"/>
+          <w:color w:val="auto"/>
+        </w:rPr>
+      </w:pPr>
+      <w:r>
+        <w:rPr>
+          <w:rFonts w:ascii="Courier New" w:hAnsi="Courier New"/>
+          <w:color w:val="auto"/>
+        </w:rPr>
+      </w:r>
+    </w:p>
+    <w:p>
+      <w:pPr>
+        <w:pStyle w:val="Code"/>
+        <w:rPr>
+          <w:rFonts w:ascii="Courier New" w:hAnsi="Courier New"/>
+          <w:color w:val="auto"/>
+        </w:rPr>
+      </w:pPr>
+      <w:r>
+        <w:rPr>
+          <w:rFonts w:ascii="Courier New" w:hAnsi="Courier New"/>
+          <w:color w:val="auto"/>
+        </w:rPr>
+        <w:t>agglomerative=AgglomerativeClustering()</w:t>
+      </w:r>
+    </w:p>
+    <w:p>
+      <w:pPr>
+        <w:pStyle w:val="Code"/>
+        <w:rPr>
+          <w:rFonts w:ascii="Courier New" w:hAnsi="Courier New"/>
+          <w:color w:val="auto"/>
+        </w:rPr>
+      </w:pPr>
+      <w:r>
+        <w:rPr>
+          <w:rFonts w:ascii="Courier New" w:hAnsi="Courier New"/>
+          <w:color w:val="auto"/>
+        </w:rPr>
+        <w:t>agglomerative_results=agglomerative.fit_predict(X_test)</w:t>
+      </w:r>
+    </w:p>
+    <w:p>
+      <w:pPr>
+        <w:pStyle w:val="Code"/>
+        <w:rPr>
+          <w:rFonts w:ascii="Courier New" w:hAnsi="Courier New"/>
+          <w:color w:val="auto"/>
+        </w:rPr>
+      </w:pPr>
+      <w:r>
+        <w:rPr>
+          <w:rFonts w:ascii="Courier New" w:hAnsi="Courier New"/>
+          <w:color w:val="auto"/>
+        </w:rPr>
+        <w:t># Кількість розбіжностей між результатами двох методів</w:t>
+      </w:r>
+    </w:p>
+    <w:p>
+      <w:pPr>
+        <w:pStyle w:val="Code"/>
+        <w:rPr>
+          <w:rFonts w:ascii="Courier New" w:hAnsi="Courier New"/>
+          <w:color w:val="auto"/>
+        </w:rPr>
+      </w:pPr>
+      <w:r>
+        <w:rPr>
+          <w:rFonts w:ascii="Courier New" w:hAnsi="Courier New"/>
+          <w:color w:val="auto"/>
+        </w:rPr>
+        <w:t>agglomerative_score=sum([agglomerative_results[i]!=kmeans_results[i] for i in range(len(kmeans_results))])</w:t>
+      </w:r>
+    </w:p>
+    <w:p>
+      <w:pPr>
+        <w:pStyle w:val="Code"/>
+        <w:rPr>
+          <w:rFonts w:ascii="Courier New" w:hAnsi="Courier New"/>
+          <w:color w:val="auto"/>
+        </w:rPr>
+      </w:pPr>
+      <w:r>
+        <w:rPr>
+          <w:rFonts w:ascii="Courier New" w:hAnsi="Courier New"/>
+          <w:color w:val="auto"/>
+        </w:rPr>
+      </w:r>
+    </w:p>
+    <w:p>
+      <w:pPr>
+        <w:pStyle w:val="Code"/>
+        <w:rPr>
+          <w:rFonts w:ascii="Courier New" w:hAnsi="Courier New"/>
+          <w:color w:val="auto"/>
+        </w:rPr>
+      </w:pPr>
+      <w:r>
+        <w:rPr>
+          <w:rFonts w:ascii="Courier New" w:hAnsi="Courier New"/>
+          <w:color w:val="auto"/>
+        </w:rPr>
+        <w:t>print(f'{kmeans_results = }')</w:t>
+      </w:r>
+    </w:p>
+    <w:p>
+      <w:pPr>
+        <w:pStyle w:val="Code"/>
+        <w:rPr>
+          <w:rFonts w:ascii="Courier New" w:hAnsi="Courier New"/>
+          <w:color w:val="auto"/>
+        </w:rPr>
+      </w:pPr>
+      <w:r>
+        <w:rPr>
+          <w:rFonts w:ascii="Courier New" w:hAnsi="Courier New"/>
+          <w:color w:val="auto"/>
+        </w:rPr>
+        <w:t>print(f'K-Means clustering accuracy: {kmeans_score}')</w:t>
+      </w:r>
+    </w:p>
+    <w:p>
+      <w:pPr>
+        <w:pStyle w:val="Code"/>
+        <w:rPr>
+          <w:rFonts w:ascii="Courier New" w:hAnsi="Courier New"/>
+          <w:color w:val="auto"/>
+        </w:rPr>
+      </w:pPr>
+      <w:r>
+        <w:rPr>
+          <w:rFonts w:ascii="Courier New" w:hAnsi="Courier New"/>
+          <w:color w:val="auto"/>
+        </w:rPr>
+        <w:t>print(f'\n{agglomerative_results = }')</w:t>
+      </w:r>
+    </w:p>
+    <w:p>
+      <w:pPr>
+        <w:pStyle w:val="Code"/>
+        <w:rPr>
+          <w:rFonts w:ascii="Courier New" w:hAnsi="Courier New"/>
+          <w:color w:val="auto"/>
+        </w:rPr>
+      </w:pPr>
+      <w:r>
+        <w:rPr>
+          <w:rFonts w:ascii="Courier New" w:hAnsi="Courier New"/>
+          <w:b w:val="false"/>
+          <w:color w:val="000000"/>
+          <w:sz w:val="21"/>
+          <w:shd w:fill="FFFFFF" w:val="clear"/>
+        </w:rPr>
+        <w:t>print(f'Hierarchical clustering results difference: {agglomerative_score}')</w:t>
+      </w:r>
+    </w:p>
+    <w:p>
+      <w:pPr>
+        <w:pStyle w:val="P1"/>
+        <w:rPr>
+          <w:color w:val="auto"/>
+          <w:lang w:val="uk-UA"/>
+        </w:rPr>
+      </w:pPr>
+      <w:r>
+        <w:rPr>
+          <w:color w:val="auto"/>
+          <w:lang w:val="uk-UA"/>
+        </w:rPr>
+      </w:r>
+    </w:p>
+    <w:p>
+      <w:pPr>
+        <w:pStyle w:val="H3"/>
+        <w:rPr/>
+      </w:pPr>
+      <w:r>
+        <w:rPr/>
+        <w:t xml:space="preserve">Результати </w:t>
+      </w:r>
+    </w:p>
+    <w:p>
+      <w:pPr>
+        <w:pStyle w:val="P1"/>
+        <w:rPr>
+          <w:color w:val="auto"/>
+          <w:lang w:val="uk-UA"/>
+        </w:rPr>
+      </w:pPr>
+      <w:r>
+        <w:rPr>
+          <w:color w:val="auto"/>
+          <w:lang w:val="uk-UA"/>
+        </w:rPr>
+      </w:r>
+    </w:p>
+    <w:p>
+      <w:pPr>
+        <w:pStyle w:val="P1"/>
+        <w:rPr>
+          <w:color w:val="auto"/>
+          <w:lang w:val="uk-UA"/>
+        </w:rPr>
+      </w:pPr>
+      <w:r>
+        <w:drawing>
+          <wp:anchor behindDoc="0" distT="0" distB="0" distL="0" distR="0" simplePos="0" locked="0" layoutInCell="0" allowOverlap="1" relativeHeight="9">
+            <wp:simplePos x="0" y="0"/>
+            <wp:positionH relativeFrom="column">
+              <wp:align>center</wp:align>
+            </wp:positionH>
+            <wp:positionV relativeFrom="paragraph">
+              <wp:posOffset>635</wp:posOffset>
+            </wp:positionV>
+            <wp:extent cx="5731510" cy="928370"/>
+            <wp:effectExtent l="0" t="0" r="0" b="0"/>
+            <wp:wrapSquare wrapText="largest"/>
+            <wp:docPr id="7" name="Зображення8" descr=""/>
+            <wp:cNvGraphicFramePr>
+              <a:graphicFrameLocks xmlns:a="http://schemas.openxmlformats.org/drawingml/2006/main" noChangeAspect="1"/>
+            </wp:cNvGraphicFramePr>
+            <a:graphic xmlns:a="http://schemas.openxmlformats.org/drawingml/2006/main">
+              <a:graphicData uri="http://schemas.openxmlformats.org/drawingml/2006/picture">
+                <pic:pic xmlns:pic="http://schemas.openxmlformats.org/drawingml/2006/picture">
+                  <pic:nvPicPr>
+                    <pic:cNvPr id="7" name="Зображення8" descr=""/>
+                    <pic:cNvPicPr>
+                      <a:picLocks noChangeAspect="1" noChangeArrowheads="1"/>
+                    </pic:cNvPicPr>
+                  </pic:nvPicPr>
+                  <pic:blipFill>
+                    <a:blip r:embed="rId8"/>
+                    <a:stretch>
+                      <a:fillRect/>
+                    </a:stretch>
+                  </pic:blipFill>
+                  <pic:spPr bwMode="auto">
+                    <a:xfrm>
+                      <a:off x="0" y="0"/>
+                      <a:ext cx="5731510" cy="928370"/>
+                    </a:xfrm>
+                    <a:prstGeom prst="rect">
+                      <a:avLst/>
+                    </a:prstGeom>
+                    <a:noFill/>
+                  </pic:spPr>
+                </pic:pic>
+              </a:graphicData>
+            </a:graphic>
+          </wp:anchor>
+        </w:drawing>
+      </w:r>
+      <w:r>
+        <w:rPr>
+          <w:color w:val="auto"/>
+          <w:lang w:val="uk-UA"/>
+        </w:rPr>
+        <w:t>Рисунок 3.1 — При кількості кластерів 2</w:t>
+      </w:r>
+    </w:p>
+    <w:p>
+      <w:pPr>
+        <w:pStyle w:val="P1"/>
+        <w:rPr>
+          <w:color w:val="auto"/>
+          <w:lang w:val="uk-UA"/>
+        </w:rPr>
+      </w:pPr>
+      <w:r>
+        <w:rPr>
+          <w:color w:val="auto"/>
+          <w:lang w:val="uk-UA"/>
+        </w:rPr>
+      </w:r>
+    </w:p>
+    <w:p>
+      <w:pPr>
+        <w:pStyle w:val="P1"/>
+        <w:rPr>
+          <w:color w:val="auto"/>
+          <w:lang w:val="uk-UA"/>
+        </w:rPr>
+      </w:pPr>
+      <w:r>
+        <w:drawing>
+          <wp:anchor behindDoc="0" distT="0" distB="0" distL="0" distR="0" simplePos="0" locked="0" layoutInCell="0" allowOverlap="1" relativeHeight="8">
+            <wp:simplePos x="0" y="0"/>
+            <wp:positionH relativeFrom="column">
+              <wp:align>center</wp:align>
+            </wp:positionH>
+            <wp:positionV relativeFrom="paragraph">
+              <wp:posOffset>635</wp:posOffset>
+            </wp:positionV>
+            <wp:extent cx="5731510" cy="902970"/>
+            <wp:effectExtent l="0" t="0" r="0" b="0"/>
+            <wp:wrapSquare wrapText="largest"/>
+            <wp:docPr id="8" name="Зображення7" descr=""/>
+            <wp:cNvGraphicFramePr>
+              <a:graphicFrameLocks xmlns:a="http://schemas.openxmlformats.org/drawingml/2006/main" noChangeAspect="1"/>
+            </wp:cNvGraphicFramePr>
+            <a:graphic xmlns:a="http://schemas.openxmlformats.org/drawingml/2006/main">
+              <a:graphicData uri="http://schemas.openxmlformats.org/drawingml/2006/picture">
+                <pic:pic xmlns:pic="http://schemas.openxmlformats.org/drawingml/2006/picture">
+                  <pic:nvPicPr>
+                    <pic:cNvPr id="8" name="Зображення7" descr=""/>
+                    <pic:cNvPicPr>
+                      <a:picLocks noChangeAspect="1" noChangeArrowheads="1"/>
+                    </pic:cNvPicPr>
+                  </pic:nvPicPr>
+                  <pic:blipFill>
+                    <a:blip r:embed="rId9"/>
+                    <a:stretch>
+                      <a:fillRect/>
+                    </a:stretch>
+                  </pic:blipFill>
+                  <pic:spPr bwMode="auto">
+                    <a:xfrm>
+                      <a:off x="0" y="0"/>
+                      <a:ext cx="5731510" cy="902970"/>
+                    </a:xfrm>
+                    <a:prstGeom prst="rect">
+                      <a:avLst/>
+                    </a:prstGeom>
+                    <a:noFill/>
+                  </pic:spPr>
+                </pic:pic>
+              </a:graphicData>
+            </a:graphic>
+          </wp:anchor>
+        </w:drawing>
+      </w:r>
+      <w:r>
+        <w:rPr>
+          <w:color w:val="auto"/>
+          <w:lang w:val="uk-UA"/>
+        </w:rPr>
+        <w:t>Рисунок 3.2 — При кількості кластерів 3</w:t>
       </w:r>
     </w:p>
     <w:p>
@@ -1834,6 +2734,377 @@
     </w:sectPr>
   </w:body>
 </w:document>
+</file>
+
+<file path=word/numbering.xml><?xml version="1.0" encoding="utf-8"?>
+<w:numbering xmlns:w="http://schemas.openxmlformats.org/wordprocessingml/2006/main" xmlns:o="urn:schemas-microsoft-com:office:office" xmlns:r="http://schemas.openxmlformats.org/officeDocument/2006/relationships" xmlns:v="urn:schemas-microsoft-com:vml" xmlns:mc="http://schemas.openxmlformats.org/markup-compatibility/2006" xmlns:w14="http://schemas.microsoft.com/office/word/2010/wordml" mc:Ignorable="w14">
+  <w:abstractNum w:abstractNumId="1">
+    <w:lvl w:ilvl="0">
+      <w:start w:val="1"/>
+      <w:numFmt w:val="decimal"/>
+      <w:lvlText w:val="%1."/>
+      <w:lvlJc w:val="left"/>
+      <w:pPr>
+        <w:tabs>
+          <w:tab w:val="num" w:pos="720"/>
+        </w:tabs>
+        <w:ind w:left="720" w:hanging="360"/>
+      </w:pPr>
+      <w:rPr/>
+    </w:lvl>
+    <w:lvl w:ilvl="1">
+      <w:start w:val="1"/>
+      <w:numFmt w:val="decimal"/>
+      <w:lvlText w:val="%2."/>
+      <w:lvlJc w:val="left"/>
+      <w:pPr>
+        <w:tabs>
+          <w:tab w:val="num" w:pos="1080"/>
+        </w:tabs>
+        <w:ind w:left="1080" w:hanging="360"/>
+      </w:pPr>
+      <w:rPr/>
+    </w:lvl>
+    <w:lvl w:ilvl="2">
+      <w:start w:val="1"/>
+      <w:numFmt w:val="decimal"/>
+      <w:lvlText w:val="%3."/>
+      <w:lvlJc w:val="left"/>
+      <w:pPr>
+        <w:tabs>
+          <w:tab w:val="num" w:pos="1440"/>
+        </w:tabs>
+        <w:ind w:left="1440" w:hanging="360"/>
+      </w:pPr>
+      <w:rPr/>
+    </w:lvl>
+    <w:lvl w:ilvl="3">
+      <w:start w:val="1"/>
+      <w:numFmt w:val="decimal"/>
+      <w:lvlText w:val="%4."/>
+      <w:lvlJc w:val="left"/>
+      <w:pPr>
+        <w:tabs>
+          <w:tab w:val="num" w:pos="1800"/>
+        </w:tabs>
+        <w:ind w:left="1800" w:hanging="360"/>
+      </w:pPr>
+      <w:rPr/>
+    </w:lvl>
+    <w:lvl w:ilvl="4">
+      <w:start w:val="1"/>
+      <w:numFmt w:val="decimal"/>
+      <w:lvlText w:val="%5."/>
+      <w:lvlJc w:val="left"/>
+      <w:pPr>
+        <w:tabs>
+          <w:tab w:val="num" w:pos="2160"/>
+        </w:tabs>
+        <w:ind w:left="2160" w:hanging="360"/>
+      </w:pPr>
+      <w:rPr/>
+    </w:lvl>
+    <w:lvl w:ilvl="5">
+      <w:start w:val="1"/>
+      <w:numFmt w:val="decimal"/>
+      <w:lvlText w:val="%6."/>
+      <w:lvlJc w:val="left"/>
+      <w:pPr>
+        <w:tabs>
+          <w:tab w:val="num" w:pos="2520"/>
+        </w:tabs>
+        <w:ind w:left="2520" w:hanging="360"/>
+      </w:pPr>
+      <w:rPr/>
+    </w:lvl>
+    <w:lvl w:ilvl="6">
+      <w:start w:val="1"/>
+      <w:numFmt w:val="decimal"/>
+      <w:lvlText w:val="%7."/>
+      <w:lvlJc w:val="left"/>
+      <w:pPr>
+        <w:tabs>
+          <w:tab w:val="num" w:pos="2880"/>
+        </w:tabs>
+        <w:ind w:left="2880" w:hanging="360"/>
+      </w:pPr>
+      <w:rPr/>
+    </w:lvl>
+    <w:lvl w:ilvl="7">
+      <w:start w:val="1"/>
+      <w:numFmt w:val="decimal"/>
+      <w:lvlText w:val="%8."/>
+      <w:lvlJc w:val="left"/>
+      <w:pPr>
+        <w:tabs>
+          <w:tab w:val="num" w:pos="3240"/>
+        </w:tabs>
+        <w:ind w:left="3240" w:hanging="360"/>
+      </w:pPr>
+      <w:rPr/>
+    </w:lvl>
+    <w:lvl w:ilvl="8">
+      <w:start w:val="1"/>
+      <w:numFmt w:val="decimal"/>
+      <w:lvlText w:val="%9."/>
+      <w:lvlJc w:val="left"/>
+      <w:pPr>
+        <w:tabs>
+          <w:tab w:val="num" w:pos="3600"/>
+        </w:tabs>
+        <w:ind w:left="3600" w:hanging="360"/>
+      </w:pPr>
+      <w:rPr/>
+    </w:lvl>
+  </w:abstractNum>
+  <w:abstractNum w:abstractNumId="2">
+    <w:lvl w:ilvl="0">
+      <w:start w:val="1"/>
+      <w:numFmt w:val="decimal"/>
+      <w:lvlText w:val="%1."/>
+      <w:lvlJc w:val="left"/>
+      <w:pPr>
+        <w:tabs>
+          <w:tab w:val="num" w:pos="1230"/>
+        </w:tabs>
+        <w:ind w:left="1230" w:hanging="360"/>
+      </w:pPr>
+      <w:rPr/>
+    </w:lvl>
+    <w:lvl w:ilvl="1">
+      <w:start w:val="1"/>
+      <w:numFmt w:val="decimal"/>
+      <w:lvlText w:val="%2."/>
+      <w:lvlJc w:val="left"/>
+      <w:pPr>
+        <w:tabs>
+          <w:tab w:val="num" w:pos="1590"/>
+        </w:tabs>
+        <w:ind w:left="1590" w:hanging="360"/>
+      </w:pPr>
+      <w:rPr/>
+    </w:lvl>
+    <w:lvl w:ilvl="2">
+      <w:start w:val="1"/>
+      <w:numFmt w:val="decimal"/>
+      <w:lvlText w:val="%3."/>
+      <w:lvlJc w:val="left"/>
+      <w:pPr>
+        <w:tabs>
+          <w:tab w:val="num" w:pos="1950"/>
+        </w:tabs>
+        <w:ind w:left="1950" w:hanging="360"/>
+      </w:pPr>
+      <w:rPr/>
+    </w:lvl>
+    <w:lvl w:ilvl="3">
+      <w:start w:val="1"/>
+      <w:numFmt w:val="decimal"/>
+      <w:lvlText w:val="%4."/>
+      <w:lvlJc w:val="left"/>
+      <w:pPr>
+        <w:tabs>
+          <w:tab w:val="num" w:pos="2310"/>
+        </w:tabs>
+        <w:ind w:left="2310" w:hanging="360"/>
+      </w:pPr>
+      <w:rPr/>
+    </w:lvl>
+    <w:lvl w:ilvl="4">
+      <w:start w:val="1"/>
+      <w:numFmt w:val="decimal"/>
+      <w:lvlText w:val="%5."/>
+      <w:lvlJc w:val="left"/>
+      <w:pPr>
+        <w:tabs>
+          <w:tab w:val="num" w:pos="2670"/>
+        </w:tabs>
+        <w:ind w:left="2670" w:hanging="360"/>
+      </w:pPr>
+      <w:rPr/>
+    </w:lvl>
+    <w:lvl w:ilvl="5">
+      <w:start w:val="1"/>
+      <w:numFmt w:val="decimal"/>
+      <w:lvlText w:val="%6."/>
+      <w:lvlJc w:val="left"/>
+      <w:pPr>
+        <w:tabs>
+          <w:tab w:val="num" w:pos="3030"/>
+        </w:tabs>
+        <w:ind w:left="3030" w:hanging="360"/>
+      </w:pPr>
+      <w:rPr/>
+    </w:lvl>
+    <w:lvl w:ilvl="6">
+      <w:start w:val="1"/>
+      <w:numFmt w:val="decimal"/>
+      <w:lvlText w:val="%7."/>
+      <w:lvlJc w:val="left"/>
+      <w:pPr>
+        <w:tabs>
+          <w:tab w:val="num" w:pos="3390"/>
+        </w:tabs>
+        <w:ind w:left="3390" w:hanging="360"/>
+      </w:pPr>
+      <w:rPr/>
+    </w:lvl>
+    <w:lvl w:ilvl="7">
+      <w:start w:val="1"/>
+      <w:numFmt w:val="decimal"/>
+      <w:lvlText w:val="%8."/>
+      <w:lvlJc w:val="left"/>
+      <w:pPr>
+        <w:tabs>
+          <w:tab w:val="num" w:pos="3750"/>
+        </w:tabs>
+        <w:ind w:left="3750" w:hanging="360"/>
+      </w:pPr>
+      <w:rPr/>
+    </w:lvl>
+    <w:lvl w:ilvl="8">
+      <w:start w:val="1"/>
+      <w:numFmt w:val="decimal"/>
+      <w:lvlText w:val="%9."/>
+      <w:lvlJc w:val="left"/>
+      <w:pPr>
+        <w:tabs>
+          <w:tab w:val="num" w:pos="4110"/>
+        </w:tabs>
+        <w:ind w:left="4110" w:hanging="360"/>
+      </w:pPr>
+      <w:rPr/>
+    </w:lvl>
+  </w:abstractNum>
+  <w:abstractNum w:abstractNumId="3">
+    <w:lvl w:ilvl="0">
+      <w:start w:val="1"/>
+      <w:numFmt w:val="none"/>
+      <w:suff w:val="nothing"/>
+      <w:lvlText w:val=""/>
+      <w:lvlJc w:val="left"/>
+      <w:pPr>
+        <w:tabs>
+          <w:tab w:val="num" w:pos="0"/>
+        </w:tabs>
+        <w:ind w:left="0" w:hanging="0"/>
+      </w:pPr>
+    </w:lvl>
+    <w:lvl w:ilvl="1">
+      <w:start w:val="1"/>
+      <w:numFmt w:val="none"/>
+      <w:suff w:val="nothing"/>
+      <w:lvlText w:val=""/>
+      <w:lvlJc w:val="left"/>
+      <w:pPr>
+        <w:tabs>
+          <w:tab w:val="num" w:pos="0"/>
+        </w:tabs>
+        <w:ind w:left="0" w:hanging="0"/>
+      </w:pPr>
+    </w:lvl>
+    <w:lvl w:ilvl="2">
+      <w:start w:val="1"/>
+      <w:numFmt w:val="none"/>
+      <w:suff w:val="nothing"/>
+      <w:lvlText w:val=""/>
+      <w:lvlJc w:val="left"/>
+      <w:pPr>
+        <w:tabs>
+          <w:tab w:val="num" w:pos="0"/>
+        </w:tabs>
+        <w:ind w:left="0" w:hanging="0"/>
+      </w:pPr>
+    </w:lvl>
+    <w:lvl w:ilvl="3">
+      <w:start w:val="1"/>
+      <w:numFmt w:val="none"/>
+      <w:suff w:val="nothing"/>
+      <w:lvlText w:val=""/>
+      <w:lvlJc w:val="left"/>
+      <w:pPr>
+        <w:tabs>
+          <w:tab w:val="num" w:pos="0"/>
+        </w:tabs>
+        <w:ind w:left="0" w:hanging="0"/>
+      </w:pPr>
+    </w:lvl>
+    <w:lvl w:ilvl="4">
+      <w:start w:val="1"/>
+      <w:numFmt w:val="none"/>
+      <w:suff w:val="nothing"/>
+      <w:lvlText w:val=""/>
+      <w:lvlJc w:val="left"/>
+      <w:pPr>
+        <w:tabs>
+          <w:tab w:val="num" w:pos="0"/>
+        </w:tabs>
+        <w:ind w:left="0" w:hanging="0"/>
+      </w:pPr>
+    </w:lvl>
+    <w:lvl w:ilvl="5">
+      <w:start w:val="1"/>
+      <w:numFmt w:val="none"/>
+      <w:suff w:val="nothing"/>
+      <w:lvlText w:val=""/>
+      <w:lvlJc w:val="left"/>
+      <w:pPr>
+        <w:tabs>
+          <w:tab w:val="num" w:pos="0"/>
+        </w:tabs>
+        <w:ind w:left="0" w:hanging="0"/>
+      </w:pPr>
+    </w:lvl>
+    <w:lvl w:ilvl="6">
+      <w:start w:val="1"/>
+      <w:numFmt w:val="none"/>
+      <w:suff w:val="nothing"/>
+      <w:lvlText w:val=""/>
+      <w:lvlJc w:val="left"/>
+      <w:pPr>
+        <w:tabs>
+          <w:tab w:val="num" w:pos="0"/>
+        </w:tabs>
+        <w:ind w:left="0" w:hanging="0"/>
+      </w:pPr>
+    </w:lvl>
+    <w:lvl w:ilvl="7">
+      <w:start w:val="1"/>
+      <w:numFmt w:val="none"/>
+      <w:suff w:val="nothing"/>
+      <w:lvlText w:val=""/>
+      <w:lvlJc w:val="left"/>
+      <w:pPr>
+        <w:tabs>
+          <w:tab w:val="num" w:pos="0"/>
+        </w:tabs>
+        <w:ind w:left="0" w:hanging="0"/>
+      </w:pPr>
+    </w:lvl>
+    <w:lvl w:ilvl="8">
+      <w:start w:val="1"/>
+      <w:numFmt w:val="none"/>
+      <w:suff w:val="nothing"/>
+      <w:lvlText w:val=""/>
+      <w:lvlJc w:val="left"/>
+      <w:pPr>
+        <w:tabs>
+          <w:tab w:val="num" w:pos="0"/>
+        </w:tabs>
+        <w:ind w:left="0" w:hanging="0"/>
+      </w:pPr>
+    </w:lvl>
+  </w:abstractNum>
+  <w:num w:numId="1">
+    <w:abstractNumId w:val="1"/>
+  </w:num>
+  <w:num w:numId="2">
+    <w:abstractNumId w:val="2"/>
+  </w:num>
+  <w:num w:numId="3">
+    <w:abstractNumId w:val="3"/>
+  </w:num>
+</w:numbering>
 </file>
 
 <file path=word/styles.xml><?xml version="1.0" encoding="utf-8"?>
@@ -2555,19 +3826,19 @@
       <w:lang w:val="en-US" w:eastAsia="uk-UA"/>
     </w:rPr>
   </w:style>
-  <w:style w:type="character" w:styleId="user">
-    <w:name w:val="Маркери (user)"/>
+  <w:style w:type="character" w:styleId="Style12">
+    <w:name w:val="Маркери"/>
     <w:qFormat/>
     <w:rPr>
       <w:rFonts w:ascii="OpenSymbol" w:hAnsi="OpenSymbol" w:eastAsia="OpenSymbol" w:cs="OpenSymbol"/>
     </w:rPr>
   </w:style>
-  <w:style w:type="character" w:styleId="user1">
-    <w:name w:val="Символ нумерації (user)"/>
+  <w:style w:type="character" w:styleId="Style13">
+    <w:name w:val="Символ нумерації"/>
     <w:qFormat/>
     <w:rPr/>
   </w:style>
-  <w:style w:type="paragraph" w:styleId="Style12">
+  <w:style w:type="paragraph" w:styleId="Style14">
     <w:name w:val="Заголовок"/>
     <w:basedOn w:val="Normal"/>
     <w:next w:val="BodyText"/>
@@ -2614,7 +3885,7 @@
       <w:szCs w:val="24"/>
     </w:rPr>
   </w:style>
-  <w:style w:type="paragraph" w:styleId="Style13">
+  <w:style w:type="paragraph" w:styleId="Style15">
     <w:name w:val="Покажчик"/>
     <w:basedOn w:val="Normal"/>
     <w:qFormat/>
@@ -2625,7 +3896,7 @@
       <w:rFonts w:cs="Arial Unicode MS"/>
     </w:rPr>
   </w:style>
-  <w:style w:type="paragraph" w:styleId="user2">
+  <w:style w:type="paragraph" w:styleId="user">
     <w:name w:val="Заголовок (user)"/>
     <w:basedOn w:val="Normal"/>
     <w:next w:val="BodyText"/>
@@ -2640,7 +3911,7 @@
       <w:szCs w:val="28"/>
     </w:rPr>
   </w:style>
-  <w:style w:type="paragraph" w:styleId="user3">
+  <w:style w:type="paragraph" w:styleId="user1">
     <w:name w:val="Покажчик (user)"/>
     <w:basedOn w:val="Normal"/>
     <w:qFormat/>
@@ -2653,7 +3924,7 @@
   </w:style>
   <w:style w:type="paragraph" w:styleId="IndexHeading">
     <w:name w:val="index heading"/>
-    <w:basedOn w:val="user2"/>
+    <w:basedOn w:val="Style14"/>
     <w:pPr/>
     <w:rPr/>
   </w:style>
@@ -2882,8 +4153,8 @@
       <w:lang w:val="en-US"/>
     </w:rPr>
   </w:style>
-  <w:style w:type="paragraph" w:styleId="user4">
-    <w:name w:val="Вміст таблиці (user)"/>
+  <w:style w:type="paragraph" w:styleId="Style16">
+    <w:name w:val="Вміст таблиці"/>
     <w:basedOn w:val="Normal"/>
     <w:qFormat/>
     <w:pPr>

</xml_diff>

<commit_message>
sp2 methods comparison better code
</commit_message>
<xml_diff>
--- a/32SS Systemy shtuchnogo/2/KNT-122_Onyshchenko_Variant-19_PR2.docx
+++ b/32SS Systemy shtuchnogo/2/KNT-122_Onyshchenko_Variant-19_PR2.docx
@@ -508,11 +508,10 @@
       <w:r>
         <w:rPr>
           <w:color w:val="auto"/>
+          <w:lang w:val="uk-UA"/>
         </w:rPr>
         <w:t>202</w:t>
       </w:r>
-      <w:bookmarkStart w:id="0" w:name="_gjdgxs"/>
-      <w:bookmarkEnd w:id="0"/>
       <w:r>
         <w:rPr>
           <w:color w:val="auto"/>
@@ -618,6 +617,252 @@
     </w:p>
     <w:p>
       <w:pPr>
+        <w:pStyle w:val="P1"/>
+        <w:rPr>
+          <w:color w:val="auto"/>
+        </w:rPr>
+      </w:pPr>
+      <w:r>
+        <w:rPr>
+          <w:color w:val="auto"/>
+        </w:rPr>
+      </w:r>
+    </w:p>
+    <w:p>
+      <w:pPr>
+        <w:pStyle w:val="P1"/>
+        <w:rPr>
+          <w:color w:val="auto"/>
+        </w:rPr>
+      </w:pPr>
+      <w:r>
+        <w:rPr>
+          <w:color w:val="auto"/>
+        </w:rPr>
+        <w:t>Завдання на роботу:</w:t>
+      </w:r>
+    </w:p>
+    <w:p>
+      <w:pPr>
+        <w:pStyle w:val="P1"/>
+        <w:rPr>
+          <w:color w:val="auto"/>
+        </w:rPr>
+      </w:pPr>
+      <w:r>
+        <w:rPr>
+          <w:color w:val="auto"/>
+        </w:rPr>
+      </w:r>
+    </w:p>
+    <w:p>
+      <w:pPr>
+        <w:pStyle w:val="P1"/>
+        <w:rPr>
+          <w:color w:val="auto"/>
+        </w:rPr>
+      </w:pPr>
+      <w:r>
+        <w:rPr>
+          <w:b w:val="false"/>
+          <w:i w:val="false"/>
+          <w:caps w:val="false"/>
+          <w:smallCaps w:val="false"/>
+          <w:color w:val="auto"/>
+          <w:spacing w:val="0"/>
+        </w:rPr>
+        <w:t xml:space="preserve">1. Ознайомитися з конспектом лекцій та рекомендованою літературою. </w:t>
+      </w:r>
+    </w:p>
+    <w:p>
+      <w:pPr>
+        <w:pStyle w:val="P1"/>
+        <w:rPr>
+          <w:color w:val="auto"/>
+        </w:rPr>
+      </w:pPr>
+      <w:r>
+        <w:rPr>
+          <w:b w:val="false"/>
+          <w:i w:val="false"/>
+          <w:caps w:val="false"/>
+          <w:smallCaps w:val="false"/>
+          <w:color w:val="auto"/>
+          <w:spacing w:val="0"/>
+        </w:rPr>
+        <w:t xml:space="preserve">2. Проаналізувати і описати вибірку «iris» з пакету «Sklearn.datasets», надати коротку характеристику наявним в вибірці ознакам. </w:t>
+      </w:r>
+    </w:p>
+    <w:p>
+      <w:pPr>
+        <w:pStyle w:val="P1"/>
+        <w:rPr>
+          <w:color w:val="auto"/>
+        </w:rPr>
+      </w:pPr>
+      <w:r>
+        <w:rPr>
+          <w:b w:val="false"/>
+          <w:i w:val="false"/>
+          <w:caps w:val="false"/>
+          <w:smallCaps w:val="false"/>
+          <w:color w:val="auto"/>
+          <w:spacing w:val="0"/>
+        </w:rPr>
+        <w:t>3. Побудувати графіки розподілу значень від ознак (6 графіків, комбінації: (sepal length, sepal width), (sepal length, petal length),</w:t>
+      </w:r>
+      <w:r>
+        <w:rPr>
+          <w:b w:val="false"/>
+          <w:i w:val="false"/>
+          <w:caps w:val="false"/>
+          <w:smallCaps w:val="false"/>
+          <w:color w:val="auto"/>
+          <w:spacing w:val="0"/>
+          <w:lang w:val="en-US"/>
+        </w:rPr>
+        <w:t xml:space="preserve"> </w:t>
+      </w:r>
+      <w:r>
+        <w:rPr>
+          <w:b w:val="false"/>
+          <w:i w:val="false"/>
+          <w:caps w:val="false"/>
+          <w:smallCaps w:val="false"/>
+          <w:color w:val="auto"/>
+          <w:spacing w:val="0"/>
+          <w:lang w:val="en-US"/>
+        </w:rPr>
+        <w:t xml:space="preserve">(petal length, petal width), (sepal length, petal width) </w:t>
+      </w:r>
+      <w:r>
+        <w:rPr>
+          <w:b w:val="false"/>
+          <w:i w:val="false"/>
+          <w:caps w:val="false"/>
+          <w:smallCaps w:val="false"/>
+          <w:color w:val="auto"/>
+          <w:spacing w:val="0"/>
+        </w:rPr>
+        <w:t xml:space="preserve">і т.д.), різними кольорами виділивши належність до цільового класу. Зробити припущення про результати кластеризації. </w:t>
+      </w:r>
+    </w:p>
+    <w:p>
+      <w:pPr>
+        <w:pStyle w:val="P1"/>
+        <w:rPr>
+          <w:color w:val="auto"/>
+        </w:rPr>
+      </w:pPr>
+      <w:r>
+        <w:rPr>
+          <w:b w:val="false"/>
+          <w:i w:val="false"/>
+          <w:caps w:val="false"/>
+          <w:smallCaps w:val="false"/>
+          <w:color w:val="auto"/>
+          <w:spacing w:val="0"/>
+        </w:rPr>
+        <w:t xml:space="preserve">4. Дослідити вибірку нижчезазначеними методами. Для кожного методу: коротко пояснити суть алгоритму, розрахувати помилки роботи, проаналізувати їх. </w:t>
+      </w:r>
+    </w:p>
+    <w:p>
+      <w:pPr>
+        <w:pStyle w:val="P1"/>
+        <w:rPr>
+          <w:color w:val="auto"/>
+        </w:rPr>
+      </w:pPr>
+      <w:r>
+        <w:rPr>
+          <w:b w:val="false"/>
+          <w:i w:val="false"/>
+          <w:caps w:val="false"/>
+          <w:smallCaps w:val="false"/>
+          <w:color w:val="auto"/>
+          <w:spacing w:val="0"/>
+        </w:rPr>
+        <w:t xml:space="preserve">4.1 Метод к–середніх (KMeans). </w:t>
+      </w:r>
+    </w:p>
+    <w:p>
+      <w:pPr>
+        <w:pStyle w:val="P1"/>
+        <w:rPr>
+          <w:color w:val="auto"/>
+        </w:rPr>
+      </w:pPr>
+      <w:r>
+        <w:rPr>
+          <w:b w:val="false"/>
+          <w:i w:val="false"/>
+          <w:caps w:val="false"/>
+          <w:smallCaps w:val="false"/>
+          <w:color w:val="auto"/>
+          <w:spacing w:val="0"/>
+        </w:rPr>
+        <w:t xml:space="preserve">4.2 Метод ієрархічної кластеризації (Hierarchical clustering). </w:t>
+      </w:r>
+    </w:p>
+    <w:p>
+      <w:pPr>
+        <w:pStyle w:val="P1"/>
+        <w:rPr>
+          <w:color w:val="auto"/>
+        </w:rPr>
+      </w:pPr>
+      <w:r>
+        <w:rPr>
+          <w:b w:val="false"/>
+          <w:i w:val="false"/>
+          <w:caps w:val="false"/>
+          <w:smallCaps w:val="false"/>
+          <w:color w:val="auto"/>
+          <w:spacing w:val="0"/>
+        </w:rPr>
+        <w:t xml:space="preserve">5. Врахувавши результати, отримані у лабораторній роботі 2 видалити частину ознак і повторити пункт пункт 4. </w:t>
+      </w:r>
+    </w:p>
+    <w:p>
+      <w:pPr>
+        <w:pStyle w:val="P1"/>
+        <w:rPr>
+          <w:color w:val="auto"/>
+        </w:rPr>
+      </w:pPr>
+      <w:r>
+        <w:rPr>
+          <w:b w:val="false"/>
+          <w:i w:val="false"/>
+          <w:caps w:val="false"/>
+          <w:smallCaps w:val="false"/>
+          <w:color w:val="auto"/>
+          <w:spacing w:val="0"/>
+        </w:rPr>
+        <w:t>6. Порівняти отримані різними методами результати, зробити висновки.</w:t>
+      </w:r>
+      <w:r>
+        <w:rPr>
+          <w:color w:val="auto"/>
+        </w:rPr>
+        <w:t xml:space="preserve"> </w:t>
+      </w:r>
+    </w:p>
+    <w:p>
+      <w:pPr>
+        <w:pStyle w:val="P1"/>
+        <w:rPr>
+          <w:color w:val="auto"/>
+        </w:rPr>
+      </w:pPr>
+      <w:r>
+        <w:rPr>
+          <w:color w:val="auto"/>
+        </w:rPr>
+      </w:r>
+    </w:p>
+    <w:p>
+      <w:pPr>
         <w:pStyle w:val="H1"/>
         <w:rPr/>
       </w:pPr>
@@ -628,6 +873,158 @@
     </w:p>
     <w:p>
       <w:pPr>
+        <w:pStyle w:val="P1"/>
+        <w:rPr/>
+      </w:pPr>
+      <w:r>
+        <w:rPr/>
+      </w:r>
+    </w:p>
+    <w:p>
+      <w:pPr>
+        <w:pStyle w:val="P1"/>
+        <w:rPr/>
+      </w:pPr>
+      <w:r>
+        <w:rPr/>
+        <w:t xml:space="preserve">Кластеризація </w:t>
+      </w:r>
+      <w:r>
+        <w:rPr>
+          <w:lang w:val="uk-UA"/>
+        </w:rPr>
+        <w:t>це метод машинного навчання без учителя (коли в нас немає вихідної ознаки), який групує елементи на основі їх схожості.</w:t>
+      </w:r>
+    </w:p>
+    <w:p>
+      <w:pPr>
+        <w:pStyle w:val="P1"/>
+        <w:rPr>
+          <w:lang w:val="uk-UA"/>
+        </w:rPr>
+      </w:pPr>
+      <w:r>
+        <w:rPr>
+          <w:lang w:val="uk-UA"/>
+        </w:rPr>
+        <w:t>Кластеризація (кластер аналіз) може бути чіткою (коли елемент належить або не належить до кластеру) або нечіткою (коли елемент належить до всіх кластерів на якийсь відсоток).</w:t>
+      </w:r>
+    </w:p>
+    <w:p>
+      <w:pPr>
+        <w:pStyle w:val="P1"/>
+        <w:rPr>
+          <w:lang w:val="uk-UA"/>
+        </w:rPr>
+      </w:pPr>
+      <w:r>
+        <w:rPr>
+          <w:lang w:val="uk-UA"/>
+        </w:rPr>
+        <w:t>Методи к-середніх та ієрархічної кластеризації є чіткими методами.</w:t>
+      </w:r>
+    </w:p>
+    <w:p>
+      <w:pPr>
+        <w:pStyle w:val="P1"/>
+        <w:rPr>
+          <w:lang w:val="uk-UA"/>
+        </w:rPr>
+      </w:pPr>
+      <w:r>
+        <w:rPr>
+          <w:lang w:val="uk-UA"/>
+        </w:rPr>
+        <w:t>Метод к-середніх шукає схожі об’єкти і групує їх в залежності від відстані до центру кластеру. Центр кластеру спочатку обирається «випадково», а потім як середнє між всіма екземплярами кластеру.</w:t>
+      </w:r>
+    </w:p>
+    <w:p>
+      <w:pPr>
+        <w:pStyle w:val="P1"/>
+        <w:rPr>
+          <w:lang w:val="uk-UA"/>
+        </w:rPr>
+      </w:pPr>
+      <w:r>
+        <w:rPr>
+          <w:lang w:val="uk-UA"/>
+        </w:rPr>
+        <w:t>Метод ієрархічної кластеризації може бути розділювальний або збиральний. У розділювальному методі спочатку є один кластер, який розбивається на два менший на кожному кроці. Це робиться доки не досягнеться вказана кількість кластерів (або інший критерій зупинки). У збиральному методі кожен елемент є власним кластером і два з них об’єднуються на кожній ітерації.</w:t>
+      </w:r>
+    </w:p>
+    <w:p>
+      <w:pPr>
+        <w:pStyle w:val="P1"/>
+        <w:rPr>
+          <w:lang w:val="uk-UA"/>
+        </w:rPr>
+      </w:pPr>
+      <w:r>
+        <w:rPr>
+          <w:lang w:val="uk-UA"/>
+        </w:rPr>
+        <w:t xml:space="preserve">Для роботи з методами кластерного аналізу у </w:t>
+      </w:r>
+      <w:r>
+        <w:rPr>
+          <w:lang w:val="en-US"/>
+        </w:rPr>
+        <w:t xml:space="preserve">scikit-learn </w:t>
+      </w:r>
+      <w:r>
+        <w:rPr>
+          <w:lang w:val="uk-UA"/>
+        </w:rPr>
+        <w:t xml:space="preserve">є пакет </w:t>
+      </w:r>
+      <w:r>
+        <w:rPr>
+          <w:lang w:val="en-US"/>
+        </w:rPr>
+        <w:t xml:space="preserve">scipy.cluster. </w:t>
+      </w:r>
+      <w:r>
+        <w:rPr>
+          <w:lang w:val="uk-UA"/>
+        </w:rPr>
+        <w:t xml:space="preserve">В ньому є класи </w:t>
+      </w:r>
+      <w:r>
+        <w:rPr>
+          <w:lang w:val="en-US"/>
+        </w:rPr>
+        <w:t xml:space="preserve">KMeans </w:t>
+      </w:r>
+      <w:r>
+        <w:rPr>
+          <w:lang w:val="uk-UA"/>
+        </w:rPr>
+        <w:t xml:space="preserve">для роботи з методом к-середніх та </w:t>
+      </w:r>
+      <w:r>
+        <w:rPr>
+          <w:lang w:val="en-US"/>
+        </w:rPr>
+        <w:t xml:space="preserve">AgglomerativeClustering </w:t>
+      </w:r>
+      <w:r>
+        <w:rPr>
+          <w:lang w:val="uk-UA"/>
+        </w:rPr>
+        <w:t>для роботи зі збиральним ієрархічним кластер аналізом.</w:t>
+      </w:r>
+    </w:p>
+    <w:p>
+      <w:pPr>
+        <w:pStyle w:val="P1"/>
+        <w:rPr/>
+      </w:pPr>
+      <w:r>
+        <w:rPr/>
+      </w:r>
+    </w:p>
+    <w:p>
+      <w:pPr>
         <w:pStyle w:val="H1"/>
         <w:rPr>
           <w:color w:val="auto"/>
@@ -671,31 +1068,14 @@
     <w:p>
       <w:pPr>
         <w:pStyle w:val="P1"/>
-        <w:rPr>
-          <w:color w:val="auto"/>
-          <w:lang w:val="uk-UA"/>
-        </w:rPr>
-      </w:pPr>
-      <w:r>
-        <w:rPr>
-          <w:color w:val="auto"/>
-          <w:lang w:val="uk-UA"/>
-        </w:rPr>
-        <w:t xml:space="preserve">Вибірка </w:t>
-      </w:r>
-      <w:r>
-        <w:rPr>
-          <w:color w:val="auto"/>
-          <w:lang w:val="en-US"/>
-        </w:rPr>
-        <w:t xml:space="preserve">iris </w:t>
-      </w:r>
-      <w:r>
-        <w:rPr>
-          <w:color w:val="auto"/>
-          <w:lang w:val="uk-UA"/>
-        </w:rPr>
-        <w:t>складається з ознак:</w:t>
+        <w:rPr/>
+      </w:pPr>
+      <w:r>
+        <w:rPr>
+          <w:color w:val="auto"/>
+          <w:lang w:val="uk-UA"/>
+        </w:rPr>
+        <w:t>Вибірка це дані про квітки іриси з такими ознаками:</w:t>
       </w:r>
     </w:p>
     <w:p>
@@ -1244,7 +1624,7 @@
     </w:p>
     <w:p>
       <w:pPr>
-        <w:pStyle w:val="P1"/>
+        <w:pStyle w:val="IMG1"/>
         <w:rPr>
           <w:lang w:val="uk-UA"/>
         </w:rPr>
@@ -1298,28 +1678,22 @@
         </w:drawing>
       </w:r>
       <w:r>
-        <w:rPr>
-          <w:lang w:val="uk-UA"/>
-        </w:rPr>
+        <w:rPr/>
         <w:t>Рисунок 2.1 — Довжина пелюсток та довжина чашечок</w:t>
       </w:r>
     </w:p>
     <w:p>
       <w:pPr>
-        <w:pStyle w:val="P1"/>
-        <w:rPr>
-          <w:lang w:val="uk-UA"/>
-        </w:rPr>
-      </w:pPr>
-      <w:r>
-        <w:rPr>
-          <w:lang w:val="uk-UA"/>
-        </w:rPr>
-      </w:r>
-    </w:p>
-    <w:p>
-      <w:pPr>
-        <w:pStyle w:val="P1"/>
+        <w:pStyle w:val="IMG1"/>
+        <w:rPr/>
+      </w:pPr>
+      <w:r>
+        <w:rPr/>
+      </w:r>
+    </w:p>
+    <w:p>
+      <w:pPr>
+        <w:pStyle w:val="IMG1"/>
         <w:rPr>
           <w:lang w:val="uk-UA"/>
         </w:rPr>
@@ -1373,28 +1747,22 @@
         </w:drawing>
       </w:r>
       <w:r>
-        <w:rPr>
-          <w:lang w:val="uk-UA"/>
-        </w:rPr>
+        <w:rPr/>
         <w:t xml:space="preserve">Рисунок 2.2 — Довжина квітки та ширина чашки </w:t>
       </w:r>
     </w:p>
     <w:p>
       <w:pPr>
-        <w:pStyle w:val="P1"/>
-        <w:rPr>
-          <w:lang w:val="uk-UA"/>
-        </w:rPr>
-      </w:pPr>
-      <w:r>
-        <w:rPr>
-          <w:lang w:val="uk-UA"/>
-        </w:rPr>
-      </w:r>
-    </w:p>
-    <w:p>
-      <w:pPr>
-        <w:pStyle w:val="P1"/>
+        <w:pStyle w:val="IMG1"/>
+        <w:rPr/>
+      </w:pPr>
+      <w:r>
+        <w:rPr/>
+      </w:r>
+    </w:p>
+    <w:p>
+      <w:pPr>
+        <w:pStyle w:val="IMG1"/>
         <w:rPr>
           <w:lang w:val="uk-UA"/>
         </w:rPr>
@@ -1448,28 +1816,22 @@
         </w:drawing>
       </w:r>
       <w:r>
-        <w:rPr>
-          <w:lang w:val="uk-UA"/>
-        </w:rPr>
+        <w:rPr/>
         <w:t>Рисунок 2.3 — Ширина та довжина квітки</w:t>
       </w:r>
     </w:p>
     <w:p>
       <w:pPr>
-        <w:pStyle w:val="P1"/>
-        <w:rPr>
-          <w:lang w:val="uk-UA"/>
-        </w:rPr>
-      </w:pPr>
-      <w:r>
-        <w:rPr>
-          <w:lang w:val="uk-UA"/>
-        </w:rPr>
-      </w:r>
-    </w:p>
-    <w:p>
-      <w:pPr>
-        <w:pStyle w:val="P1"/>
+        <w:pStyle w:val="IMG1"/>
+        <w:rPr/>
+      </w:pPr>
+      <w:r>
+        <w:rPr/>
+      </w:r>
+    </w:p>
+    <w:p>
+      <w:pPr>
+        <w:pStyle w:val="IMG1"/>
         <w:rPr>
           <w:lang w:val="uk-UA"/>
         </w:rPr>
@@ -1523,28 +1885,22 @@
         </w:drawing>
       </w:r>
       <w:r>
-        <w:rPr>
-          <w:lang w:val="uk-UA"/>
-        </w:rPr>
+        <w:rPr/>
         <w:t xml:space="preserve">Рисунок 2.4 — Ширина квітки та довжина чашки </w:t>
       </w:r>
     </w:p>
     <w:p>
       <w:pPr>
-        <w:pStyle w:val="P1"/>
-        <w:rPr>
-          <w:lang w:val="uk-UA"/>
-        </w:rPr>
-      </w:pPr>
-      <w:r>
-        <w:rPr>
-          <w:lang w:val="uk-UA"/>
-        </w:rPr>
-      </w:r>
-    </w:p>
-    <w:p>
-      <w:pPr>
-        <w:pStyle w:val="P1"/>
+        <w:pStyle w:val="IMG1"/>
+        <w:rPr/>
+      </w:pPr>
+      <w:r>
+        <w:rPr/>
+      </w:r>
+    </w:p>
+    <w:p>
+      <w:pPr>
+        <w:pStyle w:val="IMG1"/>
         <w:rPr>
           <w:lang w:val="uk-UA"/>
         </w:rPr>
@@ -1598,28 +1954,22 @@
         </w:drawing>
       </w:r>
       <w:r>
-        <w:rPr>
-          <w:lang w:val="uk-UA"/>
-        </w:rPr>
+        <w:rPr/>
         <w:t>Рисунок 2.5 — Ширина квітки та ширина чашки</w:t>
       </w:r>
     </w:p>
     <w:p>
       <w:pPr>
-        <w:pStyle w:val="P1"/>
-        <w:rPr>
-          <w:lang w:val="uk-UA"/>
-        </w:rPr>
-      </w:pPr>
-      <w:r>
-        <w:rPr>
-          <w:lang w:val="uk-UA"/>
-        </w:rPr>
-      </w:r>
-    </w:p>
-    <w:p>
-      <w:pPr>
-        <w:pStyle w:val="P1"/>
+        <w:pStyle w:val="IMG1"/>
+        <w:rPr/>
+      </w:pPr>
+      <w:r>
+        <w:rPr/>
+      </w:r>
+    </w:p>
+    <w:p>
+      <w:pPr>
+        <w:pStyle w:val="IMG1"/>
         <w:rPr>
           <w:lang w:val="uk-UA"/>
         </w:rPr>
@@ -1673,9 +2023,7 @@
         </w:drawing>
       </w:r>
       <w:r>
-        <w:rPr>
-          <w:lang w:val="uk-UA"/>
-        </w:rPr>
+        <w:rPr/>
         <w:t xml:space="preserve">Рисунок 2.6 — Ширина та довжина чашки </w:t>
       </w:r>
     </w:p>
@@ -2024,96 +2372,99 @@
         <w:pStyle w:val="P1"/>
         <w:rPr>
           <w:color w:val="auto"/>
+          <w:lang w:val="uk-UA"/>
+        </w:rPr>
+      </w:pPr>
+      <w:r>
+        <w:rPr>
+          <w:color w:val="auto"/>
+          <w:lang w:val="uk-UA"/>
+        </w:rPr>
+        <w:t>Якщо задати кількість кластерів 2, результати мають меншу помилку. Якщо кількість кластерів 3, помилка більша.</w:t>
+      </w:r>
+    </w:p>
+    <w:p>
+      <w:pPr>
+        <w:pStyle w:val="P1"/>
+        <w:rPr>
+          <w:color w:val="auto"/>
+          <w:lang w:val="uk-UA"/>
+        </w:rPr>
+      </w:pPr>
+      <w:r>
+        <w:rPr>
+          <w:color w:val="auto"/>
+          <w:lang w:val="uk-UA"/>
+        </w:rPr>
+        <w:t>Іноді метод ієрархічної кластеризації видає зворотні або дуже інші результати від методи к-середніх.</w:t>
+      </w:r>
+    </w:p>
+    <w:p>
+      <w:pPr>
+        <w:pStyle w:val="P1"/>
+        <w:rPr>
+          <w:color w:val="auto"/>
+          <w:lang w:val="uk-UA"/>
+        </w:rPr>
+      </w:pPr>
+      <w:r>
+        <w:rPr>
+          <w:color w:val="auto"/>
+          <w:lang w:val="uk-UA"/>
+        </w:rPr>
+        <w:t xml:space="preserve">Якщо явно визначити кількість кластерів (параметр </w:t>
+      </w:r>
+      <w:r>
+        <w:rPr>
+          <w:color w:val="auto"/>
           <w:lang w:val="en-US"/>
         </w:rPr>
-      </w:pPr>
-      <w:r>
-        <w:rPr>
-          <w:color w:val="auto"/>
-          <w:lang w:val="uk-UA"/>
-        </w:rPr>
-        <w:t xml:space="preserve">Для реалізації були використані класи </w:t>
+        <w:t xml:space="preserve">n_clusters) </w:t>
+      </w:r>
+      <w:r>
+        <w:rPr>
+          <w:color w:val="auto"/>
+          <w:lang w:val="uk-UA"/>
+        </w:rPr>
+        <w:t xml:space="preserve">для </w:t>
       </w:r>
       <w:r>
         <w:rPr>
           <w:color w:val="auto"/>
           <w:lang w:val="en-US"/>
         </w:rPr>
-        <w:t xml:space="preserve">KMeans </w:t>
-      </w:r>
-      <w:r>
-        <w:rPr>
-          <w:color w:val="auto"/>
-          <w:lang w:val="uk-UA"/>
-        </w:rPr>
-        <w:t xml:space="preserve">та </w:t>
-      </w:r>
-      <w:r>
-        <w:rPr>
-          <w:color w:val="auto"/>
-          <w:lang w:val="en-US"/>
-        </w:rPr>
-        <w:t xml:space="preserve">AgglomerativeClustering </w:t>
-      </w:r>
-      <w:r>
-        <w:rPr>
-          <w:color w:val="auto"/>
-          <w:lang w:val="uk-UA"/>
-        </w:rPr>
-        <w:t xml:space="preserve">з пакету </w:t>
-      </w:r>
-      <w:r>
-        <w:rPr>
-          <w:color w:val="auto"/>
-          <w:lang w:val="en-US"/>
-        </w:rPr>
-        <w:t>sklearn.cluster.</w:t>
-      </w:r>
-    </w:p>
-    <w:p>
-      <w:pPr>
-        <w:pStyle w:val="P1"/>
-        <w:rPr>
-          <w:color w:val="auto"/>
-          <w:lang w:val="uk-UA"/>
-        </w:rPr>
-      </w:pPr>
-      <w:r>
-        <w:rPr>
-          <w:color w:val="auto"/>
-          <w:lang w:val="uk-UA"/>
-        </w:rPr>
-        <w:t>Якщо задати кількість кластерів 2, результати мають меншу помилку. Якщо кількість кластерів 3, помилка більша.</w:t>
-      </w:r>
-    </w:p>
-    <w:p>
-      <w:pPr>
-        <w:pStyle w:val="P1"/>
-        <w:rPr>
-          <w:color w:val="auto"/>
-          <w:lang w:val="uk-UA"/>
-        </w:rPr>
-      </w:pPr>
-      <w:r>
-        <w:rPr>
-          <w:color w:val="auto"/>
-          <w:lang w:val="uk-UA"/>
-        </w:rPr>
-      </w:r>
-    </w:p>
-    <w:p>
-      <w:pPr>
-        <w:pStyle w:val="P1"/>
-        <w:rPr>
-          <w:color w:val="auto"/>
-          <w:lang w:val="uk-UA"/>
-        </w:rPr>
-      </w:pPr>
-      <w:r>
-        <w:rPr>
-          <w:color w:val="auto"/>
-          <w:lang w:val="uk-UA"/>
-        </w:rPr>
+        <w:t xml:space="preserve">AgglomerativeClustering, </w:t>
+      </w:r>
+      <w:r>
+        <w:rPr>
+          <w:color w:val="auto"/>
+          <w:lang w:val="uk-UA"/>
+        </w:rPr>
+        <w:t>результати гірші.</w:t>
+      </w:r>
+    </w:p>
+    <w:p>
+      <w:pPr>
+        <w:pStyle w:val="P1"/>
+        <w:rPr>
+          <w:color w:val="auto"/>
+          <w:lang w:val="uk-UA"/>
+        </w:rPr>
+      </w:pPr>
+      <w:r>
+        <w:rPr>
+          <w:color w:val="auto"/>
+          <w:lang w:val="uk-UA"/>
+        </w:rPr>
+      </w:r>
+    </w:p>
+    <w:p>
+      <w:pPr>
+        <w:pStyle w:val="H3"/>
+        <w:rPr/>
+      </w:pPr>
+      <w:r>
+        <w:rPr/>
         <w:t xml:space="preserve">Код </w:t>
       </w:r>
     </w:p>
@@ -2557,15 +2908,12 @@
     </w:p>
     <w:p>
       <w:pPr>
-        <w:pStyle w:val="P1"/>
-        <w:rPr>
-          <w:color w:val="auto"/>
-          <w:lang w:val="uk-UA"/>
-        </w:rPr>
+        <w:pStyle w:val="IMG1"/>
+        <w:rPr/>
       </w:pPr>
       <w:r>
         <w:drawing>
-          <wp:anchor behindDoc="0" distT="0" distB="0" distL="0" distR="0" simplePos="0" locked="0" layoutInCell="0" allowOverlap="1" relativeHeight="9">
+          <wp:anchor behindDoc="0" distT="0" distB="0" distL="0" distR="0" simplePos="0" locked="0" layoutInCell="0" allowOverlap="1" relativeHeight="10">
             <wp:simplePos x="0" y="0"/>
             <wp:positionH relativeFrom="column">
               <wp:align>center</wp:align>
@@ -2573,7 +2921,7 @@
             <wp:positionV relativeFrom="paragraph">
               <wp:posOffset>635</wp:posOffset>
             </wp:positionV>
-            <wp:extent cx="5731510" cy="928370"/>
+            <wp:extent cx="5731510" cy="913130"/>
             <wp:effectExtent l="0" t="0" r="0" b="0"/>
             <wp:wrapSquare wrapText="largest"/>
             <wp:docPr id="7" name="Зображення8" descr=""/>
@@ -2598,7 +2946,7 @@
                   <pic:spPr bwMode="auto">
                     <a:xfrm>
                       <a:off x="0" y="0"/>
-                      <a:ext cx="5731510" cy="928370"/>
+                      <a:ext cx="5731510" cy="913130"/>
                     </a:xfrm>
                     <a:prstGeom prst="rect">
                       <a:avLst/>
@@ -2612,39 +2960,47 @@
         </w:drawing>
       </w:r>
       <w:r>
-        <w:rPr>
-          <w:color w:val="auto"/>
-          <w:lang w:val="uk-UA"/>
-        </w:rPr>
-        <w:t>Рисунок 3.1 — При кількості кластерів 2</w:t>
-      </w:r>
-    </w:p>
-    <w:p>
-      <w:pPr>
-        <w:pStyle w:val="P1"/>
-        <w:rPr>
-          <w:color w:val="auto"/>
-          <w:lang w:val="uk-UA"/>
-        </w:rPr>
-      </w:pPr>
-      <w:r>
-        <w:rPr>
-          <w:color w:val="auto"/>
-          <w:lang w:val="uk-UA"/>
-        </w:rPr>
-      </w:r>
-    </w:p>
-    <w:p>
-      <w:pPr>
-        <w:pStyle w:val="P1"/>
-        <w:rPr>
-          <w:color w:val="auto"/>
-          <w:lang w:val="uk-UA"/>
-        </w:rPr>
+        <w:rPr/>
+        <w:t>Рисунок 3.1.</w:t>
+      </w:r>
+      <w:r>
+        <w:rPr/>
+        <w:t>1</w:t>
+      </w:r>
+      <w:r>
+        <w:rPr/>
+        <w:t xml:space="preserve"> — </w:t>
+      </w:r>
+      <w:r>
+        <w:rPr/>
+        <w:t xml:space="preserve">Кількість </w:t>
+      </w:r>
+      <w:r>
+        <w:rPr/>
+        <w:t xml:space="preserve">кластерів 2, </w:t>
+      </w:r>
+      <w:r>
+        <w:rPr/>
+        <w:t>консоль</w:t>
+      </w:r>
+    </w:p>
+    <w:p>
+      <w:pPr>
+        <w:pStyle w:val="IMG1"/>
+        <w:rPr/>
+      </w:pPr>
+      <w:r>
+        <w:rPr/>
+      </w:r>
+    </w:p>
+    <w:p>
+      <w:pPr>
+        <w:pStyle w:val="IMG1"/>
+        <w:rPr/>
       </w:pPr>
       <w:r>
         <w:drawing>
-          <wp:anchor behindDoc="0" distT="0" distB="0" distL="0" distR="0" simplePos="0" locked="0" layoutInCell="0" allowOverlap="1" relativeHeight="8">
+          <wp:anchor behindDoc="0" distT="0" distB="0" distL="0" distR="0" simplePos="0" locked="0" layoutInCell="0" allowOverlap="1" relativeHeight="11">
             <wp:simplePos x="0" y="0"/>
             <wp:positionH relativeFrom="column">
               <wp:align>center</wp:align>
@@ -2652,10 +3008,10 @@
             <wp:positionV relativeFrom="paragraph">
               <wp:posOffset>635</wp:posOffset>
             </wp:positionV>
-            <wp:extent cx="5731510" cy="902970"/>
+            <wp:extent cx="5731510" cy="4298315"/>
             <wp:effectExtent l="0" t="0" r="0" b="0"/>
             <wp:wrapSquare wrapText="largest"/>
-            <wp:docPr id="8" name="Зображення7" descr=""/>
+            <wp:docPr id="8" name="Зображення12" descr=""/>
             <wp:cNvGraphicFramePr>
               <a:graphicFrameLocks xmlns:a="http://schemas.openxmlformats.org/drawingml/2006/main" noChangeAspect="1"/>
             </wp:cNvGraphicFramePr>
@@ -2663,7 +3019,7 @@
               <a:graphicData uri="http://schemas.openxmlformats.org/drawingml/2006/picture">
                 <pic:pic xmlns:pic="http://schemas.openxmlformats.org/drawingml/2006/picture">
                   <pic:nvPicPr>
-                    <pic:cNvPr id="8" name="Зображення7" descr=""/>
+                    <pic:cNvPr id="8" name="Зображення12" descr=""/>
                     <pic:cNvPicPr>
                       <a:picLocks noChangeAspect="1" noChangeArrowheads="1"/>
                     </pic:cNvPicPr>
@@ -2677,7 +3033,7 @@
                   <pic:spPr bwMode="auto">
                     <a:xfrm>
                       <a:off x="0" y="0"/>
-                      <a:ext cx="5731510" cy="902970"/>
+                      <a:ext cx="5731510" cy="4298315"/>
                     </a:xfrm>
                     <a:prstGeom prst="rect">
                       <a:avLst/>
@@ -2691,26 +3047,1155 @@
         </w:drawing>
       </w:r>
       <w:r>
-        <w:rPr>
-          <w:color w:val="auto"/>
-          <w:lang w:val="uk-UA"/>
-        </w:rPr>
-        <w:t>Рисунок 3.2 — При кількості кластерів 3</w:t>
-      </w:r>
-    </w:p>
-    <w:p>
-      <w:pPr>
-        <w:pStyle w:val="P1"/>
-        <w:rPr>
-          <w:color w:val="auto"/>
-          <w:lang w:val="uk-UA"/>
-        </w:rPr>
-      </w:pPr>
-      <w:r>
-        <w:rPr>
-          <w:color w:val="auto"/>
-          <w:lang w:val="uk-UA"/>
-        </w:rPr>
+        <w:rPr/>
+        <w:t>Рисунок 3.1.2 — Кількість кластерів 2, графік</w:t>
+      </w:r>
+    </w:p>
+    <w:p>
+      <w:pPr>
+        <w:pStyle w:val="IMG1"/>
+        <w:rPr/>
+      </w:pPr>
+      <w:r>
+        <w:rPr/>
+      </w:r>
+    </w:p>
+    <w:p>
+      <w:pPr>
+        <w:pStyle w:val="IMG1"/>
+        <w:rPr/>
+      </w:pPr>
+      <w:r>
+        <w:drawing>
+          <wp:anchor behindDoc="0" distT="0" distB="0" distL="0" distR="0" simplePos="0" locked="0" layoutInCell="0" allowOverlap="1" relativeHeight="8">
+            <wp:simplePos x="0" y="0"/>
+            <wp:positionH relativeFrom="column">
+              <wp:align>center</wp:align>
+            </wp:positionH>
+            <wp:positionV relativeFrom="paragraph">
+              <wp:posOffset>635</wp:posOffset>
+            </wp:positionV>
+            <wp:extent cx="5731510" cy="917575"/>
+            <wp:effectExtent l="0" t="0" r="0" b="0"/>
+            <wp:wrapSquare wrapText="largest"/>
+            <wp:docPr id="9" name="Зображення7" descr=""/>
+            <wp:cNvGraphicFramePr>
+              <a:graphicFrameLocks xmlns:a="http://schemas.openxmlformats.org/drawingml/2006/main" noChangeAspect="1"/>
+            </wp:cNvGraphicFramePr>
+            <a:graphic xmlns:a="http://schemas.openxmlformats.org/drawingml/2006/main">
+              <a:graphicData uri="http://schemas.openxmlformats.org/drawingml/2006/picture">
+                <pic:pic xmlns:pic="http://schemas.openxmlformats.org/drawingml/2006/picture">
+                  <pic:nvPicPr>
+                    <pic:cNvPr id="9" name="Зображення7" descr=""/>
+                    <pic:cNvPicPr>
+                      <a:picLocks noChangeAspect="1" noChangeArrowheads="1"/>
+                    </pic:cNvPicPr>
+                  </pic:nvPicPr>
+                  <pic:blipFill>
+                    <a:blip r:embed="rId10"/>
+                    <a:stretch>
+                      <a:fillRect/>
+                    </a:stretch>
+                  </pic:blipFill>
+                  <pic:spPr bwMode="auto">
+                    <a:xfrm>
+                      <a:off x="0" y="0"/>
+                      <a:ext cx="5731510" cy="917575"/>
+                    </a:xfrm>
+                    <a:prstGeom prst="rect">
+                      <a:avLst/>
+                    </a:prstGeom>
+                    <a:noFill/>
+                  </pic:spPr>
+                </pic:pic>
+              </a:graphicData>
+            </a:graphic>
+          </wp:anchor>
+        </w:drawing>
+      </w:r>
+      <w:r>
+        <w:rPr/>
+        <w:t>Рисунок 3.2.</w:t>
+      </w:r>
+      <w:r>
+        <w:rPr>
+          <w:lang w:val="en-US"/>
+        </w:rPr>
+        <w:t>1</w:t>
+      </w:r>
+      <w:r>
+        <w:rPr/>
+        <w:t xml:space="preserve"> — </w:t>
+      </w:r>
+      <w:r>
+        <w:rPr/>
+        <w:t xml:space="preserve">Кількість </w:t>
+      </w:r>
+      <w:r>
+        <w:rPr/>
+        <w:t xml:space="preserve">кластерів 3, </w:t>
+      </w:r>
+      <w:r>
+        <w:rPr/>
+        <w:t>консоль</w:t>
+      </w:r>
+    </w:p>
+    <w:p>
+      <w:pPr>
+        <w:pStyle w:val="IMG1"/>
+        <w:rPr/>
+      </w:pPr>
+      <w:r>
+        <w:rPr/>
+      </w:r>
+    </w:p>
+    <w:p>
+      <w:pPr>
+        <w:pStyle w:val="IMG1"/>
+        <w:rPr/>
+      </w:pPr>
+      <w:r>
+        <w:drawing>
+          <wp:anchor behindDoc="0" distT="0" distB="0" distL="0" distR="0" simplePos="0" locked="0" layoutInCell="0" allowOverlap="1" relativeHeight="9">
+            <wp:simplePos x="0" y="0"/>
+            <wp:positionH relativeFrom="column">
+              <wp:align>center</wp:align>
+            </wp:positionH>
+            <wp:positionV relativeFrom="paragraph">
+              <wp:posOffset>635</wp:posOffset>
+            </wp:positionV>
+            <wp:extent cx="5731510" cy="4298315"/>
+            <wp:effectExtent l="0" t="0" r="0" b="0"/>
+            <wp:wrapSquare wrapText="largest"/>
+            <wp:docPr id="10" name="Зображення11" descr=""/>
+            <wp:cNvGraphicFramePr>
+              <a:graphicFrameLocks xmlns:a="http://schemas.openxmlformats.org/drawingml/2006/main" noChangeAspect="1"/>
+            </wp:cNvGraphicFramePr>
+            <a:graphic xmlns:a="http://schemas.openxmlformats.org/drawingml/2006/main">
+              <a:graphicData uri="http://schemas.openxmlformats.org/drawingml/2006/picture">
+                <pic:pic xmlns:pic="http://schemas.openxmlformats.org/drawingml/2006/picture">
+                  <pic:nvPicPr>
+                    <pic:cNvPr id="10" name="Зображення11" descr=""/>
+                    <pic:cNvPicPr>
+                      <a:picLocks noChangeAspect="1" noChangeArrowheads="1"/>
+                    </pic:cNvPicPr>
+                  </pic:nvPicPr>
+                  <pic:blipFill>
+                    <a:blip r:embed="rId11"/>
+                    <a:stretch>
+                      <a:fillRect/>
+                    </a:stretch>
+                  </pic:blipFill>
+                  <pic:spPr bwMode="auto">
+                    <a:xfrm>
+                      <a:off x="0" y="0"/>
+                      <a:ext cx="5731510" cy="4298315"/>
+                    </a:xfrm>
+                    <a:prstGeom prst="rect">
+                      <a:avLst/>
+                    </a:prstGeom>
+                    <a:noFill/>
+                  </pic:spPr>
+                </pic:pic>
+              </a:graphicData>
+            </a:graphic>
+          </wp:anchor>
+        </w:drawing>
+      </w:r>
+      <w:r>
+        <w:rPr/>
+        <w:t>Рисунок 3.2.2 — Кількість кластерів 2, графік</w:t>
+      </w:r>
+    </w:p>
+    <w:p>
+      <w:pPr>
+        <w:pStyle w:val="P1"/>
+        <w:rPr>
+          <w:color w:val="auto"/>
+          <w:lang w:val="uk-UA"/>
+        </w:rPr>
+      </w:pPr>
+      <w:r>
+        <w:rPr>
+          <w:color w:val="auto"/>
+          <w:lang w:val="uk-UA"/>
+        </w:rPr>
+      </w:r>
+    </w:p>
+    <w:p>
+      <w:pPr>
+        <w:pStyle w:val="H2"/>
+        <w:rPr/>
+      </w:pPr>
+      <w:r>
+        <w:rPr/>
+        <w:t xml:space="preserve">4 </w:t>
+      </w:r>
+      <w:r>
+        <w:rPr>
+          <w:lang w:val="uk-UA"/>
+        </w:rPr>
+        <w:t>Видалення ознак</w:t>
+      </w:r>
+    </w:p>
+    <w:p>
+      <w:pPr>
+        <w:pStyle w:val="P1"/>
+        <w:rPr>
+          <w:color w:val="auto"/>
+          <w:lang w:val="uk-UA"/>
+        </w:rPr>
+      </w:pPr>
+      <w:r>
+        <w:rPr>
+          <w:color w:val="auto"/>
+          <w:lang w:val="uk-UA"/>
+        </w:rPr>
+      </w:r>
+    </w:p>
+    <w:p>
+      <w:pPr>
+        <w:pStyle w:val="P1"/>
+        <w:rPr>
+          <w:color w:val="auto"/>
+          <w:lang w:val="uk-UA"/>
+        </w:rPr>
+      </w:pPr>
+      <w:r>
+        <w:rPr>
+          <w:color w:val="auto"/>
+          <w:lang w:val="uk-UA"/>
+        </w:rPr>
+        <w:t>Залишимо тільки ширину та довжину чашечки.</w:t>
+      </w:r>
+    </w:p>
+    <w:p>
+      <w:pPr>
+        <w:pStyle w:val="P1"/>
+        <w:rPr>
+          <w:color w:val="auto"/>
+          <w:lang w:val="uk-UA"/>
+        </w:rPr>
+      </w:pPr>
+      <w:r>
+        <w:rPr>
+          <w:color w:val="auto"/>
+          <w:lang w:val="uk-UA"/>
+        </w:rPr>
+      </w:r>
+    </w:p>
+    <w:p>
+      <w:pPr>
+        <w:pStyle w:val="H3"/>
+        <w:rPr/>
+      </w:pPr>
+      <w:r>
+        <w:rPr/>
+        <w:t xml:space="preserve">Код </w:t>
+      </w:r>
+    </w:p>
+    <w:p>
+      <w:pPr>
+        <w:pStyle w:val="P1"/>
+        <w:rPr/>
+      </w:pPr>
+      <w:r>
+        <w:rPr/>
+      </w:r>
+    </w:p>
+    <w:p>
+      <w:pPr>
+        <w:pStyle w:val="Code"/>
+        <w:rPr>
+          <w:color w:val="auto"/>
+        </w:rPr>
+      </w:pPr>
+      <w:r>
+        <w:rPr>
+          <w:color w:val="auto"/>
+        </w:rPr>
+        <w:t>from matplotlib import pyplot as plt</w:t>
+      </w:r>
+    </w:p>
+    <w:p>
+      <w:pPr>
+        <w:pStyle w:val="Code"/>
+        <w:rPr>
+          <w:color w:val="auto"/>
+        </w:rPr>
+      </w:pPr>
+      <w:r>
+        <w:rPr>
+          <w:color w:val="auto"/>
+        </w:rPr>
+        <w:t>from sklearn.cluster import AgglomerativeClustering, KMeans</w:t>
+      </w:r>
+    </w:p>
+    <w:p>
+      <w:pPr>
+        <w:pStyle w:val="Code"/>
+        <w:rPr>
+          <w:color w:val="auto"/>
+        </w:rPr>
+      </w:pPr>
+      <w:r>
+        <w:rPr>
+          <w:color w:val="auto"/>
+        </w:rPr>
+        <w:t>from sklearn.datasets import load_iris</w:t>
+      </w:r>
+    </w:p>
+    <w:p>
+      <w:pPr>
+        <w:pStyle w:val="Code"/>
+        <w:rPr>
+          <w:color w:val="auto"/>
+        </w:rPr>
+      </w:pPr>
+      <w:r>
+        <w:rPr>
+          <w:color w:val="auto"/>
+        </w:rPr>
+        <w:t>from sklearn.model_selection import train_test_split</w:t>
+      </w:r>
+    </w:p>
+    <w:p>
+      <w:pPr>
+        <w:pStyle w:val="Code"/>
+        <w:rPr>
+          <w:color w:val="auto"/>
+        </w:rPr>
+      </w:pPr>
+      <w:r>
+        <w:rPr>
+          <w:color w:val="auto"/>
+        </w:rPr>
+      </w:r>
+    </w:p>
+    <w:p>
+      <w:pPr>
+        <w:pStyle w:val="Code"/>
+        <w:rPr>
+          <w:color w:val="auto"/>
+        </w:rPr>
+      </w:pPr>
+      <w:r>
+        <w:rPr>
+          <w:color w:val="auto"/>
+        </w:rPr>
+        <w:t>iris=load_iris()</w:t>
+      </w:r>
+    </w:p>
+    <w:p>
+      <w:pPr>
+        <w:pStyle w:val="Code"/>
+        <w:rPr>
+          <w:color w:val="auto"/>
+        </w:rPr>
+      </w:pPr>
+      <w:r>
+        <w:rPr>
+          <w:color w:val="auto"/>
+        </w:rPr>
+        <w:t>X=iris.data</w:t>
+      </w:r>
+    </w:p>
+    <w:p>
+      <w:pPr>
+        <w:pStyle w:val="Code"/>
+        <w:rPr>
+          <w:color w:val="auto"/>
+        </w:rPr>
+      </w:pPr>
+      <w:r>
+        <w:rPr>
+          <w:color w:val="auto"/>
+        </w:rPr>
+        <w:t>X=X[:,:2]</w:t>
+      </w:r>
+    </w:p>
+    <w:p>
+      <w:pPr>
+        <w:pStyle w:val="Code"/>
+        <w:rPr>
+          <w:color w:val="auto"/>
+        </w:rPr>
+      </w:pPr>
+      <w:r>
+        <w:rPr>
+          <w:color w:val="auto"/>
+        </w:rPr>
+        <w:t>print(X,iris.feature_names[:2])</w:t>
+      </w:r>
+    </w:p>
+    <w:p>
+      <w:pPr>
+        <w:pStyle w:val="Code"/>
+        <w:rPr>
+          <w:color w:val="auto"/>
+        </w:rPr>
+      </w:pPr>
+      <w:r>
+        <w:rPr>
+          <w:color w:val="auto"/>
+        </w:rPr>
+        <w:t>y=iris.target</w:t>
+      </w:r>
+    </w:p>
+    <w:p>
+      <w:pPr>
+        <w:pStyle w:val="Code"/>
+        <w:rPr>
+          <w:color w:val="auto"/>
+        </w:rPr>
+      </w:pPr>
+      <w:r>
+        <w:rPr>
+          <w:color w:val="auto"/>
+        </w:rPr>
+        <w:t># Розбиття вибірки на тестову та тренувальну</w:t>
+      </w:r>
+    </w:p>
+    <w:p>
+      <w:pPr>
+        <w:pStyle w:val="Code"/>
+        <w:rPr>
+          <w:color w:val="auto"/>
+        </w:rPr>
+      </w:pPr>
+      <w:r>
+        <w:rPr>
+          <w:color w:val="auto"/>
+        </w:rPr>
+        <w:t>X_train,X_test,y_train,y_test=train_test_split(X,y)</w:t>
+      </w:r>
+    </w:p>
+    <w:p>
+      <w:pPr>
+        <w:pStyle w:val="Code"/>
+        <w:rPr>
+          <w:color w:val="auto"/>
+        </w:rPr>
+      </w:pPr>
+      <w:r>
+        <w:rPr>
+          <w:color w:val="auto"/>
+        </w:rPr>
+      </w:r>
+    </w:p>
+    <w:p>
+      <w:pPr>
+        <w:pStyle w:val="Code"/>
+        <w:rPr>
+          <w:color w:val="auto"/>
+        </w:rPr>
+      </w:pPr>
+      <w:r>
+        <w:rPr>
+          <w:color w:val="auto"/>
+        </w:rPr>
+        <w:t>kmeans=KMeans(n_clusters=2)</w:t>
+      </w:r>
+    </w:p>
+    <w:p>
+      <w:pPr>
+        <w:pStyle w:val="Code"/>
+        <w:rPr>
+          <w:color w:val="auto"/>
+        </w:rPr>
+      </w:pPr>
+      <w:r>
+        <w:rPr>
+          <w:color w:val="auto"/>
+        </w:rPr>
+        <w:t>kmeans_results=kmeans.fit_predict(X_test)</w:t>
+      </w:r>
+    </w:p>
+    <w:p>
+      <w:pPr>
+        <w:pStyle w:val="Code"/>
+        <w:rPr>
+          <w:color w:val="auto"/>
+        </w:rPr>
+      </w:pPr>
+      <w:r>
+        <w:rPr>
+          <w:color w:val="auto"/>
+        </w:rPr>
+        <w:t># Оцінка похибки методу</w:t>
+      </w:r>
+    </w:p>
+    <w:p>
+      <w:pPr>
+        <w:pStyle w:val="Code"/>
+        <w:rPr>
+          <w:color w:val="auto"/>
+        </w:rPr>
+      </w:pPr>
+      <w:r>
+        <w:rPr>
+          <w:color w:val="auto"/>
+        </w:rPr>
+        <w:t>kmeans_score=kmeans.score(X_test)/len(X_test)</w:t>
+      </w:r>
+    </w:p>
+    <w:p>
+      <w:pPr>
+        <w:pStyle w:val="Code"/>
+        <w:rPr>
+          <w:color w:val="auto"/>
+        </w:rPr>
+      </w:pPr>
+      <w:r>
+        <w:rPr>
+          <w:color w:val="auto"/>
+        </w:rPr>
+      </w:r>
+    </w:p>
+    <w:p>
+      <w:pPr>
+        <w:pStyle w:val="Code"/>
+        <w:rPr>
+          <w:color w:val="auto"/>
+        </w:rPr>
+      </w:pPr>
+      <w:r>
+        <w:rPr>
+          <w:color w:val="auto"/>
+        </w:rPr>
+        <w:t>agglomerative=AgglomerativeClustering()</w:t>
+      </w:r>
+    </w:p>
+    <w:p>
+      <w:pPr>
+        <w:pStyle w:val="Code"/>
+        <w:rPr>
+          <w:color w:val="auto"/>
+        </w:rPr>
+      </w:pPr>
+      <w:r>
+        <w:rPr>
+          <w:color w:val="auto"/>
+        </w:rPr>
+        <w:t>agglomerative_results=agglomerative.fit_predict(X_test)</w:t>
+      </w:r>
+    </w:p>
+    <w:p>
+      <w:pPr>
+        <w:pStyle w:val="Code"/>
+        <w:rPr>
+          <w:color w:val="auto"/>
+        </w:rPr>
+      </w:pPr>
+      <w:r>
+        <w:rPr>
+          <w:color w:val="auto"/>
+        </w:rPr>
+        <w:t># Кількість розбіжностей між результатами двох методів</w:t>
+      </w:r>
+    </w:p>
+    <w:p>
+      <w:pPr>
+        <w:pStyle w:val="Code"/>
+        <w:rPr>
+          <w:color w:val="auto"/>
+        </w:rPr>
+      </w:pPr>
+      <w:r>
+        <w:rPr>
+          <w:color w:val="auto"/>
+        </w:rPr>
+        <w:t>agglomerative_score=sum([agglomerative_results[i]!=kmeans_results[i] for i in range(len(kmeans_results))])</w:t>
+      </w:r>
+    </w:p>
+    <w:p>
+      <w:pPr>
+        <w:pStyle w:val="Code"/>
+        <w:rPr>
+          <w:color w:val="auto"/>
+        </w:rPr>
+      </w:pPr>
+      <w:r>
+        <w:rPr>
+          <w:color w:val="auto"/>
+        </w:rPr>
+      </w:r>
+    </w:p>
+    <w:p>
+      <w:pPr>
+        <w:pStyle w:val="Code"/>
+        <w:rPr>
+          <w:color w:val="auto"/>
+        </w:rPr>
+      </w:pPr>
+      <w:r>
+        <w:rPr>
+          <w:color w:val="auto"/>
+        </w:rPr>
+        <w:t>print(f'\n{kmeans_results = }')</w:t>
+      </w:r>
+    </w:p>
+    <w:p>
+      <w:pPr>
+        <w:pStyle w:val="Code"/>
+        <w:rPr>
+          <w:color w:val="auto"/>
+        </w:rPr>
+      </w:pPr>
+      <w:r>
+        <w:rPr>
+          <w:color w:val="auto"/>
+        </w:rPr>
+        <w:t>print(f'K-Means clustering accuracy: {kmeans_score}')</w:t>
+      </w:r>
+    </w:p>
+    <w:p>
+      <w:pPr>
+        <w:pStyle w:val="Code"/>
+        <w:rPr>
+          <w:color w:val="auto"/>
+        </w:rPr>
+      </w:pPr>
+      <w:r>
+        <w:rPr>
+          <w:color w:val="auto"/>
+        </w:rPr>
+        <w:t>print(f'\n{agglomerative_results = }')</w:t>
+      </w:r>
+    </w:p>
+    <w:p>
+      <w:pPr>
+        <w:pStyle w:val="Code"/>
+        <w:rPr>
+          <w:color w:val="auto"/>
+        </w:rPr>
+      </w:pPr>
+      <w:r>
+        <w:rPr>
+          <w:color w:val="auto"/>
+        </w:rPr>
+        <w:t>print(f'Hierarchical clustering results difference: {agglomerative_score}')</w:t>
+      </w:r>
+    </w:p>
+    <w:p>
+      <w:pPr>
+        <w:pStyle w:val="Code"/>
+        <w:rPr>
+          <w:color w:val="auto"/>
+        </w:rPr>
+      </w:pPr>
+      <w:r>
+        <w:rPr>
+          <w:color w:val="auto"/>
+        </w:rPr>
+      </w:r>
+    </w:p>
+    <w:p>
+      <w:pPr>
+        <w:pStyle w:val="Code"/>
+        <w:rPr>
+          <w:color w:val="auto"/>
+        </w:rPr>
+      </w:pPr>
+      <w:r>
+        <w:rPr>
+          <w:color w:val="auto"/>
+        </w:rPr>
+        <w:t>plot=plt.scatter(X_test[:,0],X_test[:,1],c=kmeans_results,cmap='viridis')</w:t>
+      </w:r>
+    </w:p>
+    <w:p>
+      <w:pPr>
+        <w:pStyle w:val="Code"/>
+        <w:rPr>
+          <w:color w:val="auto"/>
+        </w:rPr>
+      </w:pPr>
+      <w:r>
+        <w:rPr>
+          <w:color w:val="auto"/>
+        </w:rPr>
+        <w:t>plt.legend(plot.legend_elements()[0], iris.target_names.tolist())</w:t>
+      </w:r>
+    </w:p>
+    <w:p>
+      <w:pPr>
+        <w:pStyle w:val="Code"/>
+        <w:rPr>
+          <w:color w:val="auto"/>
+        </w:rPr>
+      </w:pPr>
+      <w:r>
+        <w:rPr>
+          <w:color w:val="auto"/>
+        </w:rPr>
+        <w:t>plt.show()</w:t>
+      </w:r>
+    </w:p>
+    <w:p>
+      <w:pPr>
+        <w:pStyle w:val="Code"/>
+        <w:rPr>
+          <w:color w:val="auto"/>
+        </w:rPr>
+      </w:pPr>
+      <w:r>
+        <w:rPr>
+          <w:color w:val="auto"/>
+        </w:rPr>
+      </w:r>
+    </w:p>
+    <w:p>
+      <w:pPr>
+        <w:pStyle w:val="H2"/>
+        <w:rPr/>
+      </w:pPr>
+      <w:r>
+        <w:rPr/>
+        <w:t xml:space="preserve">Результати </w:t>
+      </w:r>
+    </w:p>
+    <w:p>
+      <w:pPr>
+        <w:pStyle w:val="P1"/>
+        <w:rPr>
+          <w:color w:val="auto"/>
+          <w:lang w:val="uk-UA"/>
+        </w:rPr>
+      </w:pPr>
+      <w:r>
+        <w:rPr>
+          <w:color w:val="auto"/>
+          <w:lang w:val="uk-UA"/>
+        </w:rPr>
+      </w:r>
+    </w:p>
+    <w:p>
+      <w:pPr>
+        <w:pStyle w:val="P1"/>
+        <w:rPr>
+          <w:color w:val="auto"/>
+          <w:lang w:val="uk-UA"/>
+        </w:rPr>
+      </w:pPr>
+      <w:r>
+        <w:drawing>
+          <wp:anchor behindDoc="0" distT="0" distB="0" distL="0" distR="0" simplePos="0" locked="0" layoutInCell="0" allowOverlap="1" relativeHeight="13">
+            <wp:simplePos x="0" y="0"/>
+            <wp:positionH relativeFrom="column">
+              <wp:align>center</wp:align>
+            </wp:positionH>
+            <wp:positionV relativeFrom="paragraph">
+              <wp:posOffset>635</wp:posOffset>
+            </wp:positionV>
+            <wp:extent cx="5731510" cy="899795"/>
+            <wp:effectExtent l="0" t="0" r="0" b="0"/>
+            <wp:wrapSquare wrapText="largest"/>
+            <wp:docPr id="11" name="Зображення9" descr=""/>
+            <wp:cNvGraphicFramePr>
+              <a:graphicFrameLocks xmlns:a="http://schemas.openxmlformats.org/drawingml/2006/main" noChangeAspect="1"/>
+            </wp:cNvGraphicFramePr>
+            <a:graphic xmlns:a="http://schemas.openxmlformats.org/drawingml/2006/main">
+              <a:graphicData uri="http://schemas.openxmlformats.org/drawingml/2006/picture">
+                <pic:pic xmlns:pic="http://schemas.openxmlformats.org/drawingml/2006/picture">
+                  <pic:nvPicPr>
+                    <pic:cNvPr id="11" name="Зображення9" descr=""/>
+                    <pic:cNvPicPr>
+                      <a:picLocks noChangeAspect="1" noChangeArrowheads="1"/>
+                    </pic:cNvPicPr>
+                  </pic:nvPicPr>
+                  <pic:blipFill>
+                    <a:blip r:embed="rId12"/>
+                    <a:stretch>
+                      <a:fillRect/>
+                    </a:stretch>
+                  </pic:blipFill>
+                  <pic:spPr bwMode="auto">
+                    <a:xfrm>
+                      <a:off x="0" y="0"/>
+                      <a:ext cx="5731510" cy="899795"/>
+                    </a:xfrm>
+                    <a:prstGeom prst="rect">
+                      <a:avLst/>
+                    </a:prstGeom>
+                    <a:noFill/>
+                  </pic:spPr>
+                </pic:pic>
+              </a:graphicData>
+            </a:graphic>
+          </wp:anchor>
+        </w:drawing>
+      </w:r>
+      <w:r>
+        <w:rPr>
+          <w:color w:val="auto"/>
+          <w:lang w:val="uk-UA"/>
+        </w:rPr>
+        <w:t>Рисунок 4.1.</w:t>
+      </w:r>
+      <w:r>
+        <w:rPr>
+          <w:color w:val="auto"/>
+          <w:lang w:val="uk-UA"/>
+        </w:rPr>
+        <w:t>1</w:t>
+      </w:r>
+      <w:r>
+        <w:rPr>
+          <w:color w:val="auto"/>
+          <w:lang w:val="uk-UA"/>
+        </w:rPr>
+        <w:t xml:space="preserve"> — </w:t>
+      </w:r>
+      <w:r>
+        <w:rPr>
+          <w:color w:val="auto"/>
+          <w:lang w:val="uk-UA"/>
+        </w:rPr>
+        <w:t xml:space="preserve">Кількість </w:t>
+      </w:r>
+      <w:r>
+        <w:rPr>
+          <w:color w:val="auto"/>
+          <w:lang w:val="uk-UA"/>
+        </w:rPr>
+        <w:t xml:space="preserve">кластерів 2, </w:t>
+      </w:r>
+      <w:r>
+        <w:rPr>
+          <w:color w:val="auto"/>
+          <w:lang w:val="uk-UA"/>
+        </w:rPr>
+        <w:t>консоль</w:t>
+      </w:r>
+    </w:p>
+    <w:p>
+      <w:pPr>
+        <w:pStyle w:val="P1"/>
+        <w:rPr>
+          <w:color w:val="auto"/>
+          <w:lang w:val="uk-UA"/>
+        </w:rPr>
+      </w:pPr>
+      <w:r>
+        <w:rPr>
+          <w:color w:val="auto"/>
+          <w:lang w:val="uk-UA"/>
+        </w:rPr>
+      </w:r>
+    </w:p>
+    <w:p>
+      <w:pPr>
+        <w:pStyle w:val="P1"/>
+        <w:rPr>
+          <w:color w:val="auto"/>
+          <w:lang w:val="uk-UA"/>
+        </w:rPr>
+      </w:pPr>
+      <w:r>
+        <w:drawing>
+          <wp:anchor behindDoc="0" distT="0" distB="0" distL="0" distR="0" simplePos="0" locked="0" layoutInCell="0" allowOverlap="1" relativeHeight="14">
+            <wp:simplePos x="0" y="0"/>
+            <wp:positionH relativeFrom="column">
+              <wp:align>center</wp:align>
+            </wp:positionH>
+            <wp:positionV relativeFrom="paragraph">
+              <wp:posOffset>635</wp:posOffset>
+            </wp:positionV>
+            <wp:extent cx="5731510" cy="4298315"/>
+            <wp:effectExtent l="0" t="0" r="0" b="0"/>
+            <wp:wrapSquare wrapText="largest"/>
+            <wp:docPr id="12" name="Зображення13" descr=""/>
+            <wp:cNvGraphicFramePr>
+              <a:graphicFrameLocks xmlns:a="http://schemas.openxmlformats.org/drawingml/2006/main" noChangeAspect="1"/>
+            </wp:cNvGraphicFramePr>
+            <a:graphic xmlns:a="http://schemas.openxmlformats.org/drawingml/2006/main">
+              <a:graphicData uri="http://schemas.openxmlformats.org/drawingml/2006/picture">
+                <pic:pic xmlns:pic="http://schemas.openxmlformats.org/drawingml/2006/picture">
+                  <pic:nvPicPr>
+                    <pic:cNvPr id="12" name="Зображення13" descr=""/>
+                    <pic:cNvPicPr>
+                      <a:picLocks noChangeAspect="1" noChangeArrowheads="1"/>
+                    </pic:cNvPicPr>
+                  </pic:nvPicPr>
+                  <pic:blipFill>
+                    <a:blip r:embed="rId13"/>
+                    <a:stretch>
+                      <a:fillRect/>
+                    </a:stretch>
+                  </pic:blipFill>
+                  <pic:spPr bwMode="auto">
+                    <a:xfrm>
+                      <a:off x="0" y="0"/>
+                      <a:ext cx="5731510" cy="4298315"/>
+                    </a:xfrm>
+                    <a:prstGeom prst="rect">
+                      <a:avLst/>
+                    </a:prstGeom>
+                    <a:noFill/>
+                  </pic:spPr>
+                </pic:pic>
+              </a:graphicData>
+            </a:graphic>
+          </wp:anchor>
+        </w:drawing>
+      </w:r>
+      <w:r>
+        <w:rPr>
+          <w:color w:val="auto"/>
+          <w:lang w:val="uk-UA"/>
+        </w:rPr>
+        <w:t>Рисунок 4.1.2 — Кількість кластерів 2, графік</w:t>
+      </w:r>
+    </w:p>
+    <w:p>
+      <w:pPr>
+        <w:pStyle w:val="P1"/>
+        <w:rPr>
+          <w:color w:val="auto"/>
+          <w:lang w:val="uk-UA"/>
+        </w:rPr>
+      </w:pPr>
+      <w:r>
+        <w:rPr>
+          <w:color w:val="auto"/>
+          <w:lang w:val="uk-UA"/>
+        </w:rPr>
+      </w:r>
+    </w:p>
+    <w:p>
+      <w:pPr>
+        <w:pStyle w:val="P1"/>
+        <w:rPr>
+          <w:color w:val="auto"/>
+          <w:lang w:val="uk-UA"/>
+        </w:rPr>
+      </w:pPr>
+      <w:r>
+        <w:drawing>
+          <wp:anchor behindDoc="0" distT="0" distB="0" distL="0" distR="0" simplePos="0" locked="0" layoutInCell="0" allowOverlap="1" relativeHeight="12">
+            <wp:simplePos x="0" y="0"/>
+            <wp:positionH relativeFrom="column">
+              <wp:align>center</wp:align>
+            </wp:positionH>
+            <wp:positionV relativeFrom="paragraph">
+              <wp:posOffset>635</wp:posOffset>
+            </wp:positionV>
+            <wp:extent cx="5731510" cy="934720"/>
+            <wp:effectExtent l="0" t="0" r="0" b="0"/>
+            <wp:wrapSquare wrapText="largest"/>
+            <wp:docPr id="13" name="Зображення10" descr=""/>
+            <wp:cNvGraphicFramePr>
+              <a:graphicFrameLocks xmlns:a="http://schemas.openxmlformats.org/drawingml/2006/main" noChangeAspect="1"/>
+            </wp:cNvGraphicFramePr>
+            <a:graphic xmlns:a="http://schemas.openxmlformats.org/drawingml/2006/main">
+              <a:graphicData uri="http://schemas.openxmlformats.org/drawingml/2006/picture">
+                <pic:pic xmlns:pic="http://schemas.openxmlformats.org/drawingml/2006/picture">
+                  <pic:nvPicPr>
+                    <pic:cNvPr id="13" name="Зображення10" descr=""/>
+                    <pic:cNvPicPr>
+                      <a:picLocks noChangeAspect="1" noChangeArrowheads="1"/>
+                    </pic:cNvPicPr>
+                  </pic:nvPicPr>
+                  <pic:blipFill>
+                    <a:blip r:embed="rId14"/>
+                    <a:stretch>
+                      <a:fillRect/>
+                    </a:stretch>
+                  </pic:blipFill>
+                  <pic:spPr bwMode="auto">
+                    <a:xfrm>
+                      <a:off x="0" y="0"/>
+                      <a:ext cx="5731510" cy="934720"/>
+                    </a:xfrm>
+                    <a:prstGeom prst="rect">
+                      <a:avLst/>
+                    </a:prstGeom>
+                    <a:noFill/>
+                  </pic:spPr>
+                </pic:pic>
+              </a:graphicData>
+            </a:graphic>
+          </wp:anchor>
+        </w:drawing>
+      </w:r>
+      <w:r>
+        <w:rPr>
+          <w:color w:val="auto"/>
+          <w:lang w:val="uk-UA"/>
+        </w:rPr>
+        <w:t>Рисунок 4.2.</w:t>
+      </w:r>
+      <w:r>
+        <w:rPr>
+          <w:color w:val="auto"/>
+          <w:lang w:val="uk-UA"/>
+        </w:rPr>
+        <w:t>1</w:t>
+      </w:r>
+      <w:r>
+        <w:rPr>
+          <w:color w:val="auto"/>
+          <w:lang w:val="uk-UA"/>
+        </w:rPr>
+        <w:t xml:space="preserve"> — </w:t>
+      </w:r>
+      <w:r>
+        <w:rPr>
+          <w:color w:val="auto"/>
+          <w:lang w:val="uk-UA"/>
+        </w:rPr>
+        <w:t xml:space="preserve">Кількість </w:t>
+      </w:r>
+      <w:r>
+        <w:rPr>
+          <w:color w:val="auto"/>
+          <w:lang w:val="uk-UA"/>
+        </w:rPr>
+        <w:t xml:space="preserve">кластерів 3, </w:t>
+      </w:r>
+      <w:r>
+        <w:rPr>
+          <w:color w:val="auto"/>
+          <w:lang w:val="uk-UA"/>
+        </w:rPr>
+        <w:t>консоль</w:t>
+      </w:r>
+    </w:p>
+    <w:p>
+      <w:pPr>
+        <w:pStyle w:val="P1"/>
+        <w:rPr>
+          <w:color w:val="auto"/>
+          <w:lang w:val="uk-UA"/>
+        </w:rPr>
+      </w:pPr>
+      <w:r>
+        <w:rPr>
+          <w:color w:val="auto"/>
+          <w:lang w:val="uk-UA"/>
+        </w:rPr>
+      </w:r>
+    </w:p>
+    <w:p>
+      <w:pPr>
+        <w:pStyle w:val="P1"/>
+        <w:rPr>
+          <w:color w:val="auto"/>
+          <w:lang w:val="uk-UA"/>
+        </w:rPr>
+      </w:pPr>
+      <w:r>
+        <w:drawing>
+          <wp:anchor behindDoc="0" distT="0" distB="0" distL="0" distR="0" simplePos="0" locked="0" layoutInCell="0" allowOverlap="1" relativeHeight="15">
+            <wp:simplePos x="0" y="0"/>
+            <wp:positionH relativeFrom="column">
+              <wp:align>center</wp:align>
+            </wp:positionH>
+            <wp:positionV relativeFrom="paragraph">
+              <wp:posOffset>635</wp:posOffset>
+            </wp:positionV>
+            <wp:extent cx="5731510" cy="4298315"/>
+            <wp:effectExtent l="0" t="0" r="0" b="0"/>
+            <wp:wrapSquare wrapText="largest"/>
+            <wp:docPr id="14" name="Зображення14" descr=""/>
+            <wp:cNvGraphicFramePr>
+              <a:graphicFrameLocks xmlns:a="http://schemas.openxmlformats.org/drawingml/2006/main" noChangeAspect="1"/>
+            </wp:cNvGraphicFramePr>
+            <a:graphic xmlns:a="http://schemas.openxmlformats.org/drawingml/2006/main">
+              <a:graphicData uri="http://schemas.openxmlformats.org/drawingml/2006/picture">
+                <pic:pic xmlns:pic="http://schemas.openxmlformats.org/drawingml/2006/picture">
+                  <pic:nvPicPr>
+                    <pic:cNvPr id="14" name="Зображення14" descr=""/>
+                    <pic:cNvPicPr>
+                      <a:picLocks noChangeAspect="1" noChangeArrowheads="1"/>
+                    </pic:cNvPicPr>
+                  </pic:nvPicPr>
+                  <pic:blipFill>
+                    <a:blip r:embed="rId15"/>
+                    <a:stretch>
+                      <a:fillRect/>
+                    </a:stretch>
+                  </pic:blipFill>
+                  <pic:spPr bwMode="auto">
+                    <a:xfrm>
+                      <a:off x="0" y="0"/>
+                      <a:ext cx="5731510" cy="4298315"/>
+                    </a:xfrm>
+                    <a:prstGeom prst="rect">
+                      <a:avLst/>
+                    </a:prstGeom>
+                    <a:noFill/>
+                  </pic:spPr>
+                </pic:pic>
+              </a:graphicData>
+            </a:graphic>
+          </wp:anchor>
+        </w:drawing>
+      </w:r>
+      <w:r>
+        <w:rPr>
+          <w:color w:val="auto"/>
+          <w:lang w:val="uk-UA"/>
+        </w:rPr>
+        <w:t>Рисунок 4.2.2 — Кількість кластерів 3, графік</w:t>
+      </w:r>
+    </w:p>
+    <w:p>
+      <w:pPr>
+        <w:pStyle w:val="P1"/>
+        <w:rPr>
+          <w:color w:val="auto"/>
+          <w:lang w:val="uk-UA"/>
+        </w:rPr>
+      </w:pPr>
+      <w:r>
+        <w:rPr>
+          <w:color w:val="auto"/>
+          <w:lang w:val="uk-UA"/>
+        </w:rPr>
+      </w:r>
+    </w:p>
+    <w:p>
+      <w:pPr>
+        <w:pStyle w:val="H1"/>
+        <w:rPr/>
+      </w:pPr>
+      <w:r>
+        <w:rPr/>
+        <w:t>Висновки</w:t>
+      </w:r>
+    </w:p>
+    <w:p>
+      <w:pPr>
+        <w:pStyle w:val="P1"/>
+        <w:rPr/>
+      </w:pPr>
+      <w:r>
+        <w:rPr/>
+      </w:r>
+    </w:p>
+    <w:p>
+      <w:pPr>
+        <w:pStyle w:val="P1"/>
+        <w:rPr>
+          <w:lang w:val="uk-UA"/>
+        </w:rPr>
+      </w:pPr>
+      <w:r>
+        <w:rPr>
+          <w:lang w:val="uk-UA"/>
+        </w:rPr>
+        <w:t>При роботі з двома методами виявлено, що метод К-середніх працює надійніше</w:t>
+      </w:r>
+    </w:p>
+    <w:p>
+      <w:pPr>
+        <w:pStyle w:val="P1"/>
+        <w:rPr/>
+      </w:pPr>
+      <w:r>
+        <w:rPr/>
       </w:r>
     </w:p>
     <w:p>

</xml_diff>